<commit_message>
Pengembangan fitur ULT dan perbaikan tampilan
</commit_message>
<xml_diff>
--- a/docs/admin-guide.docx
+++ b/docs/admin-guide.docx
@@ -4,41 +4,31 @@
   <w:body>
     <w:p>
       <w:pPr>
-        <w:spacing w:before="1800"/>
-        <w:jc w:val="center"/>
+        <w:pStyle w:val="Title"/>
       </w:pPr>
       <w:r>
-        <w:rPr>
-          <w:b/>
-          <w:color w:val="701D6B"/>
-          <w:sz w:val="60"/>
-        </w:rPr>
-        <w:t>PANDUAN ADMIN</w:t>
+        <w:t>Panduan Admin Website ULT Unpad</w:t>
       </w:r>
     </w:p>
     <w:p>
       <w:pPr>
-        <w:jc w:val="center"/>
+        <w:pStyle w:val="Subtitle"/>
       </w:pPr>
       <w:r>
         <w:rPr>
-          <w:sz w:val="32"/>
+          <w:color w:val="463C46"/>
         </w:rPr>
-        <w:t>Website Unit Layanan Terpadu Unpad</w:t>
-      </w:r>
-    </w:p>
-    <w:p>
-      <w:pPr>
-        <w:spacing w:before="600"/>
-        <w:jc w:val="center"/>
-      </w:pPr>
-      <w:r>
-        <w:t>Filament CMS • Tambah, lihat, edit, hapus, publikasi, dan konten bilingual</w:t>
+        <w:t>Panduan operasional untuk mengelola konten, publikasi, data survei, tombol kontak, dan impor CSV melalui Filament CMS.</w:t>
       </w:r>
     </w:p>
     <w:p>
       <w:r>
-        <w:br w:type="page"/>
+        <w:rPr>
+          <w:b/>
+          <w:color w:val="6F1D69"/>
+          <w:sz w:val="18"/>
+        </w:rPr>
+        <w:t>Versi dokumentasi: 4 September 2026</w:t>
       </w:r>
     </w:p>
     <w:p>
@@ -46,17 +36,536 @@
         <w:pStyle w:val="Heading1"/>
       </w:pPr>
       <w:r>
-        <w:t>1. Mengakses Admin</w:t>
+        <w:t>Akses dan kewenangan admin</w:t>
       </w:r>
     </w:p>
     <w:p>
       <w:r>
-        <w:t>Buka /admin pada domain website, misalnya https://ult.unpad.ac.id/admin. Masuk memakai akun admin resmi yang sudah diaktifkan. Akun harus berstatus admin, email terverifikasi, dan menggunakan domain email yang diizinkan.</w:t>
+        <w:t>Buka /admin pada domain website. Akun hanya dapat masuk jika berstatus admin, email sudah terverifikasi, dan domain email termasuk daftar yang diizinkan. Admin website mengelola konten publik; pengaturan server, database, backup, dan akun tetap menjadi tanggung jawab administrator teknis.</w:t>
+      </w:r>
+    </w:p>
+    <w:tbl>
+      <w:tblPr>
+        <w:tblStyle w:val="TableGrid"/>
+        <w:tblW w:type="auto" w:w="0"/>
+        <w:tblLayout w:type="fixed"/>
+        <w:tblLook w:firstColumn="1" w:firstRow="1" w:lastColumn="0" w:lastRow="0" w:noHBand="0" w:noVBand="1" w:val="04A0"/>
+        <w:tblBorders>
+          <w:top w:val="single" w:sz="4" w:color="D9D9D9"/>
+          <w:left w:val="single" w:sz="4" w:color="D9D9D9"/>
+          <w:bottom w:val="single" w:sz="4" w:color="D9D9D9"/>
+          <w:right w:val="single" w:sz="4" w:color="D9D9D9"/>
+          <w:insideH w:val="single" w:sz="4" w:color="D9D9D9"/>
+          <w:insideV w:val="single" w:sz="4" w:color="D9D9D9"/>
+        </w:tblBorders>
+      </w:tblPr>
+      <w:tblGrid>
+        <w:gridCol w:w="3331"/>
+        <w:gridCol w:w="3331"/>
+        <w:gridCol w:w="3331"/>
+      </w:tblGrid>
+      <w:tr>
+        <w:tc>
+          <w:tcPr>
+            <w:tcW w:type="dxa" w:w="1800"/>
+            <w:shd w:fill="292129"/>
+            <w:vAlign w:val="center"/>
+          </w:tcPr>
+          <w:p>
+            <w:r>
+              <w:rPr>
+                <w:b/>
+                <w:color w:val="FFFFFF"/>
+                <w:sz w:val="18"/>
+              </w:rPr>
+              <w:t>Area</w:t>
+            </w:r>
+          </w:p>
+        </w:tc>
+        <w:tc>
+          <w:tcPr>
+            <w:tcW w:type="dxa" w:w="4536"/>
+            <w:shd w:fill="292129"/>
+            <w:vAlign w:val="center"/>
+          </w:tcPr>
+          <w:p>
+            <w:r>
+              <w:rPr>
+                <w:b/>
+                <w:color w:val="FFFFFF"/>
+                <w:sz w:val="18"/>
+              </w:rPr>
+              <w:t>Yang dapat dilakukan admin</w:t>
+            </w:r>
+          </w:p>
+        </w:tc>
+        <w:tc>
+          <w:tcPr>
+            <w:tcW w:type="dxa" w:w="3240"/>
+            <w:shd w:fill="292129"/>
+            <w:vAlign w:val="center"/>
+          </w:tcPr>
+          <w:p>
+            <w:r>
+              <w:rPr>
+                <w:b/>
+                <w:color w:val="FFFFFF"/>
+                <w:sz w:val="18"/>
+              </w:rPr>
+              <w:t>Dampak ke website</w:t>
+            </w:r>
+          </w:p>
+        </w:tc>
+      </w:tr>
+      <w:tr>
+        <w:tc>
+          <w:tcPr>
+            <w:tcW w:type="dxa" w:w="1800"/>
+            <w:vAlign w:val="center"/>
+          </w:tcPr>
+          <w:p>
+            <w:pPr>
+              <w:spacing w:after="40"/>
+            </w:pPr>
+            <w:r>
+              <w:rPr>
+                <w:sz w:val="17"/>
+              </w:rPr>
+              <w:t>Dashboard</w:t>
+            </w:r>
+          </w:p>
+        </w:tc>
+        <w:tc>
+          <w:tcPr>
+            <w:tcW w:type="dxa" w:w="4536"/>
+            <w:vAlign w:val="center"/>
+          </w:tcPr>
+          <w:p>
+            <w:pPr>
+              <w:spacing w:after="40"/>
+            </w:pPr>
+            <w:r>
+              <w:rPr>
+                <w:sz w:val="17"/>
+              </w:rPr>
+              <w:t>Melihat ringkasan konten dan trafik bulanan</w:t>
+            </w:r>
+          </w:p>
+        </w:tc>
+        <w:tc>
+          <w:tcPr>
+            <w:tcW w:type="dxa" w:w="3240"/>
+            <w:vAlign w:val="center"/>
+          </w:tcPr>
+          <w:p>
+            <w:pPr>
+              <w:spacing w:after="40"/>
+            </w:pPr>
+            <w:r>
+              <w:rPr>
+                <w:sz w:val="17"/>
+              </w:rPr>
+              <w:t>Tidak mengubah konten</w:t>
+            </w:r>
+          </w:p>
+        </w:tc>
+      </w:tr>
+      <w:tr>
+        <w:tc>
+          <w:tcPr>
+            <w:tcW w:type="dxa" w:w="1800"/>
+            <w:vAlign w:val="center"/>
+            <w:shd w:fill="F7F0F6"/>
+          </w:tcPr>
+          <w:p>
+            <w:pPr>
+              <w:spacing w:after="40"/>
+            </w:pPr>
+            <w:r>
+              <w:rPr>
+                <w:sz w:val="17"/>
+              </w:rPr>
+              <w:t>Kategori Layanan</w:t>
+            </w:r>
+          </w:p>
+        </w:tc>
+        <w:tc>
+          <w:tcPr>
+            <w:tcW w:type="dxa" w:w="4536"/>
+            <w:vAlign w:val="center"/>
+            <w:shd w:fill="F7F0F6"/>
+          </w:tcPr>
+          <w:p>
+            <w:pPr>
+              <w:spacing w:after="40"/>
+            </w:pPr>
+            <w:r>
+              <w:rPr>
+                <w:sz w:val="17"/>
+              </w:rPr>
+              <w:t>Tambah, edit, urutkan, tandai unggulan</w:t>
+            </w:r>
+          </w:p>
+        </w:tc>
+        <w:tc>
+          <w:tcPr>
+            <w:tcW w:type="dxa" w:w="3240"/>
+            <w:vAlign w:val="center"/>
+            <w:shd w:fill="F7F0F6"/>
+          </w:tcPr>
+          <w:p>
+            <w:pPr>
+              <w:spacing w:after="40"/>
+            </w:pPr>
+            <w:r>
+              <w:rPr>
+                <w:sz w:val="17"/>
+              </w:rPr>
+              <w:t>Mengubah kelompok layanan</w:t>
+            </w:r>
+          </w:p>
+        </w:tc>
+      </w:tr>
+      <w:tr>
+        <w:tc>
+          <w:tcPr>
+            <w:tcW w:type="dxa" w:w="1800"/>
+            <w:vAlign w:val="center"/>
+          </w:tcPr>
+          <w:p>
+            <w:pPr>
+              <w:spacing w:after="40"/>
+            </w:pPr>
+            <w:r>
+              <w:rPr>
+                <w:sz w:val="17"/>
+              </w:rPr>
+              <w:t>Layanan</w:t>
+            </w:r>
+          </w:p>
+        </w:tc>
+        <w:tc>
+          <w:tcPr>
+            <w:tcW w:type="dxa" w:w="4536"/>
+            <w:vAlign w:val="center"/>
+          </w:tcPr>
+          <w:p>
+            <w:pPr>
+              <w:spacing w:after="40"/>
+            </w:pPr>
+            <w:r>
+              <w:rPr>
+                <w:sz w:val="17"/>
+              </w:rPr>
+              <w:t>CRUD, tombol kontak, publikasi, impor CSV</w:t>
+            </w:r>
+          </w:p>
+        </w:tc>
+        <w:tc>
+          <w:tcPr>
+            <w:tcW w:type="dxa" w:w="3240"/>
+            <w:vAlign w:val="center"/>
+          </w:tcPr>
+          <w:p>
+            <w:pPr>
+              <w:spacing w:after="40"/>
+            </w:pPr>
+            <w:r>
+              <w:rPr>
+                <w:sz w:val="17"/>
+              </w:rPr>
+              <w:t>Mengubah direktori dan detail layanan</w:t>
+            </w:r>
+          </w:p>
+        </w:tc>
+      </w:tr>
+      <w:tr>
+        <w:tc>
+          <w:tcPr>
+            <w:tcW w:type="dxa" w:w="1800"/>
+            <w:vAlign w:val="center"/>
+            <w:shd w:fill="F7F0F6"/>
+          </w:tcPr>
+          <w:p>
+            <w:pPr>
+              <w:spacing w:after="40"/>
+            </w:pPr>
+            <w:r>
+              <w:rPr>
+                <w:sz w:val="17"/>
+              </w:rPr>
+              <w:t>Artikel</w:t>
+            </w:r>
+          </w:p>
+        </w:tc>
+        <w:tc>
+          <w:tcPr>
+            <w:tcW w:type="dxa" w:w="4536"/>
+            <w:vAlign w:val="center"/>
+            <w:shd w:fill="F7F0F6"/>
+          </w:tcPr>
+          <w:p>
+            <w:pPr>
+              <w:spacing w:after="40"/>
+            </w:pPr>
+            <w:r>
+              <w:rPr>
+                <w:sz w:val="17"/>
+              </w:rPr>
+              <w:t>CRUD, gambar, link opsional, publikasi, impor CSV</w:t>
+            </w:r>
+          </w:p>
+        </w:tc>
+        <w:tc>
+          <w:tcPr>
+            <w:tcW w:type="dxa" w:w="3240"/>
+            <w:vAlign w:val="center"/>
+            <w:shd w:fill="F7F0F6"/>
+          </w:tcPr>
+          <w:p>
+            <w:pPr>
+              <w:spacing w:after="40"/>
+            </w:pPr>
+            <w:r>
+              <w:rPr>
+                <w:sz w:val="17"/>
+              </w:rPr>
+              <w:t>Mengubah artikel dan carousel beranda</w:t>
+            </w:r>
+          </w:p>
+        </w:tc>
+      </w:tr>
+      <w:tr>
+        <w:tc>
+          <w:tcPr>
+            <w:tcW w:type="dxa" w:w="1800"/>
+            <w:vAlign w:val="center"/>
+          </w:tcPr>
+          <w:p>
+            <w:pPr>
+              <w:spacing w:after="40"/>
+            </w:pPr>
+            <w:r>
+              <w:rPr>
+                <w:sz w:val="17"/>
+              </w:rPr>
+              <w:t>FAQ</w:t>
+            </w:r>
+          </w:p>
+        </w:tc>
+        <w:tc>
+          <w:tcPr>
+            <w:tcW w:type="dxa" w:w="4536"/>
+            <w:vAlign w:val="center"/>
+          </w:tcPr>
+          <w:p>
+            <w:pPr>
+              <w:spacing w:after="40"/>
+            </w:pPr>
+            <w:r>
+              <w:rPr>
+                <w:sz w:val="17"/>
+              </w:rPr>
+              <w:t>CRUD, kategori, link opsional, unggulan, impor CSV</w:t>
+            </w:r>
+          </w:p>
+        </w:tc>
+        <w:tc>
+          <w:tcPr>
+            <w:tcW w:type="dxa" w:w="3240"/>
+            <w:vAlign w:val="center"/>
+          </w:tcPr>
+          <w:p>
+            <w:pPr>
+              <w:spacing w:after="40"/>
+            </w:pPr>
+            <w:r>
+              <w:rPr>
+                <w:sz w:val="17"/>
+              </w:rPr>
+              <w:t>Mengubah FAQ dan FAQ beranda</w:t>
+            </w:r>
+          </w:p>
+        </w:tc>
+      </w:tr>
+      <w:tr>
+        <w:tc>
+          <w:tcPr>
+            <w:tcW w:type="dxa" w:w="1800"/>
+            <w:vAlign w:val="center"/>
+            <w:shd w:fill="F7F0F6"/>
+          </w:tcPr>
+          <w:p>
+            <w:pPr>
+              <w:spacing w:after="40"/>
+            </w:pPr>
+            <w:r>
+              <w:rPr>
+                <w:sz w:val="17"/>
+              </w:rPr>
+              <w:t>Survei Kepuasan</w:t>
+            </w:r>
+          </w:p>
+        </w:tc>
+        <w:tc>
+          <w:tcPr>
+            <w:tcW w:type="dxa" w:w="4536"/>
+            <w:vAlign w:val="center"/>
+            <w:shd w:fill="F7F0F6"/>
+          </w:tcPr>
+          <w:p>
+            <w:pPr>
+              <w:spacing w:after="40"/>
+            </w:pPr>
+            <w:r>
+              <w:rPr>
+                <w:sz w:val="17"/>
+              </w:rPr>
+              <w:t>Empat skor per tahun dan dua tautan</w:t>
+            </w:r>
+          </w:p>
+        </w:tc>
+        <w:tc>
+          <w:tcPr>
+            <w:tcW w:type="dxa" w:w="3240"/>
+            <w:vAlign w:val="center"/>
+            <w:shd w:fill="F7F0F6"/>
+          </w:tcPr>
+          <w:p>
+            <w:pPr>
+              <w:spacing w:after="40"/>
+            </w:pPr>
+            <w:r>
+              <w:rPr>
+                <w:sz w:val="17"/>
+              </w:rPr>
+              <w:t>Mengubah bagian SKM pada Profil</w:t>
+            </w:r>
+          </w:p>
+        </w:tc>
+      </w:tr>
+      <w:tr>
+        <w:tc>
+          <w:tcPr>
+            <w:tcW w:type="dxa" w:w="1800"/>
+            <w:vAlign w:val="center"/>
+          </w:tcPr>
+          <w:p>
+            <w:pPr>
+              <w:spacing w:after="40"/>
+            </w:pPr>
+            <w:r>
+              <w:rPr>
+                <w:sz w:val="17"/>
+              </w:rPr>
+              <w:t>Kontak</w:t>
+            </w:r>
+          </w:p>
+        </w:tc>
+        <w:tc>
+          <w:tcPr>
+            <w:tcW w:type="dxa" w:w="4536"/>
+            <w:vAlign w:val="center"/>
+          </w:tcPr>
+          <w:p>
+            <w:pPr>
+              <w:spacing w:after="40"/>
+            </w:pPr>
+            <w:r>
+              <w:rPr>
+                <w:sz w:val="17"/>
+              </w:rPr>
+              <w:t>WhatsApp, helpdesk, sosial, email, alamat</w:t>
+            </w:r>
+          </w:p>
+        </w:tc>
+        <w:tc>
+          <w:tcPr>
+            <w:tcW w:type="dxa" w:w="3240"/>
+            <w:vAlign w:val="center"/>
+          </w:tcPr>
+          <w:p>
+            <w:pPr>
+              <w:spacing w:after="40"/>
+            </w:pPr>
+            <w:r>
+              <w:rPr>
+                <w:sz w:val="17"/>
+              </w:rPr>
+              <w:t>Mengubah halaman kontak dan footer</w:t>
+            </w:r>
+          </w:p>
+        </w:tc>
+      </w:tr>
+      <w:tr>
+        <w:tc>
+          <w:tcPr>
+            <w:tcW w:type="dxa" w:w="1800"/>
+            <w:vAlign w:val="center"/>
+            <w:shd w:fill="F7F0F6"/>
+          </w:tcPr>
+          <w:p>
+            <w:pPr>
+              <w:spacing w:after="40"/>
+            </w:pPr>
+            <w:r>
+              <w:rPr>
+                <w:sz w:val="17"/>
+              </w:rPr>
+              <w:t>Tautan Cepat</w:t>
+            </w:r>
+          </w:p>
+        </w:tc>
+        <w:tc>
+          <w:tcPr>
+            <w:tcW w:type="dxa" w:w="4536"/>
+            <w:vAlign w:val="center"/>
+            <w:shd w:fill="F7F0F6"/>
+          </w:tcPr>
+          <w:p>
+            <w:pPr>
+              <w:spacing w:after="40"/>
+            </w:pPr>
+            <w:r>
+              <w:rPr>
+                <w:sz w:val="17"/>
+              </w:rPr>
+              <w:t>Nama, deskripsi, URL, urutan, status</w:t>
+            </w:r>
+          </w:p>
+        </w:tc>
+        <w:tc>
+          <w:tcPr>
+            <w:tcW w:type="dxa" w:w="3240"/>
+            <w:vAlign w:val="center"/>
+            <w:shd w:fill="F7F0F6"/>
+          </w:tcPr>
+          <w:p>
+            <w:pPr>
+              <w:spacing w:after="40"/>
+            </w:pPr>
+            <w:r>
+              <w:rPr>
+                <w:sz w:val="17"/>
+              </w:rPr>
+              <w:t>Mengubah tautan publik</w:t>
+            </w:r>
+          </w:p>
+        </w:tc>
+      </w:tr>
+    </w:tbl>
+    <w:p/>
+    <w:p>
+      <w:pPr>
+        <w:pStyle w:val="Heading1"/>
+      </w:pPr>
+      <w:r>
+        <w:t>Tema dashboard</w:t>
       </w:r>
     </w:p>
     <w:p>
       <w:r>
-        <w:t>Jika kredensial ditolak, jangan membuat akun baru sembarangan. Hubungi administrator teknis untuk memeriksa record users, is_admin, email_verified_at, dan domain email.</w:t>
+        <w:t>Menu pengguna di kanan atas menyediakan Light, Dark, atau System. Pilihan ini hanya memengaruhi dashboard admin dan disimpan pada browser yang digunakan.</w:t>
       </w:r>
     </w:p>
     <w:p>
@@ -64,12 +573,60 @@
         <w:pStyle w:val="Heading1"/>
       </w:pPr>
       <w:r>
-        <w:t>2. Tampilan dan Tema</w:t>
+        <w:t>Alur kerja perubahan konten</w:t>
+      </w:r>
+    </w:p>
+    <w:p>
+      <w:pPr>
+        <w:pStyle w:val="ListNumber"/>
+      </w:pPr>
+      <w:r>
+        <w:t>Buka resource yang akan dikelola dan cari record yang tepat.</w:t>
+      </w:r>
+    </w:p>
+    <w:p>
+      <w:pPr>
+        <w:pStyle w:val="ListNumber"/>
+      </w:pPr>
+      <w:r>
+        <w:t>Buat atau edit record. Lengkapi Bahasa Indonesia dan English pada record yang sama.</w:t>
+      </w:r>
+    </w:p>
+    <w:p>
+      <w:pPr>
+        <w:pStyle w:val="ListNumber"/>
+      </w:pPr>
+      <w:r>
+        <w:t>Periksa slug, URL resmi, pemilik konten, tanggal, dan status publikasi.</w:t>
+      </w:r>
+    </w:p>
+    <w:p>
+      <w:pPr>
+        <w:pStyle w:val="ListNumber"/>
+      </w:pPr>
+      <w:r>
+        <w:t>Simpan sebagai draft dengan mematikan Terbit jika konten belum disetujui.</w:t>
+      </w:r>
+    </w:p>
+    <w:p>
+      <w:pPr>
+        <w:pStyle w:val="ListNumber"/>
+      </w:pPr>
+      <w:r>
+        <w:t>Aktifkan Terbit atau Aktif setelah pemeriksaan selesai.</w:t>
+      </w:r>
+    </w:p>
+    <w:p>
+      <w:pPr>
+        <w:pStyle w:val="ListNumber"/>
+      </w:pPr>
+      <w:r>
+        <w:t>Buka halaman publik dalam ID dan EN, lalu periksa tampilan desktop dan ponsel.</w:t>
       </w:r>
     </w:p>
     <w:p>
       <w:r>
-        <w:t>Gunakan menu pengguna di kanan atas untuk memilih tema Light, Dark, atau mengikuti sistem. Pilihan disimpan di browser dan tidak mengubah tampilan website publik.</w:t>
+        <w:t>Frontend dan admin menggunakan database yang sama. Perubahan yang disimpan dan dipublikasikan tampil pada request berikutnya tanpa deploy ulang.</w:t>
       </w:r>
     </w:p>
     <w:p>
@@ -77,89 +634,417 @@
         <w:pStyle w:val="Heading1"/>
       </w:pPr>
       <w:r>
-        <w:t>3. Cara Kerja Perubahan Konten</w:t>
+        <w:t>Operasi data umum</w:t>
       </w:r>
     </w:p>
-    <w:p>
-      <w:r>
-        <w:t>Frontend dan admin menggunakan database yang sama. Setelah record disimpan dan status Terbit/Aktif dinyalakan, perubahan langsung dibaca website pada request berikutnya. Tidak perlu deploy ulang. Jika cache produksi digunakan dan teks belum berubah, jalankan php artisan optimize:clear lalu muat ulang halaman.</w:t>
-      </w:r>
-    </w:p>
+    <w:tbl>
+      <w:tblPr>
+        <w:tblStyle w:val="TableGrid"/>
+        <w:tblW w:type="auto" w:w="0"/>
+        <w:tblLayout w:type="fixed"/>
+        <w:tblLook w:firstColumn="1" w:firstRow="1" w:lastColumn="0" w:lastRow="0" w:noHBand="0" w:noVBand="1" w:val="04A0"/>
+        <w:tblBorders>
+          <w:top w:val="single" w:sz="4" w:color="D9D9D9"/>
+          <w:left w:val="single" w:sz="4" w:color="D9D9D9"/>
+          <w:bottom w:val="single" w:sz="4" w:color="D9D9D9"/>
+          <w:right w:val="single" w:sz="4" w:color="D9D9D9"/>
+          <w:insideH w:val="single" w:sz="4" w:color="D9D9D9"/>
+          <w:insideV w:val="single" w:sz="4" w:color="D9D9D9"/>
+        </w:tblBorders>
+      </w:tblPr>
+      <w:tblGrid>
+        <w:gridCol w:w="3331"/>
+        <w:gridCol w:w="3331"/>
+        <w:gridCol w:w="3331"/>
+      </w:tblGrid>
+      <w:tr>
+        <w:tc>
+          <w:tcPr>
+            <w:tcW w:type="dxa" w:w="1944"/>
+            <w:shd w:fill="292129"/>
+            <w:vAlign w:val="center"/>
+          </w:tcPr>
+          <w:p>
+            <w:r>
+              <w:rPr>
+                <w:b/>
+                <w:color w:val="FFFFFF"/>
+                <w:sz w:val="18"/>
+              </w:rPr>
+              <w:t>Operasi</w:t>
+            </w:r>
+          </w:p>
+        </w:tc>
+        <w:tc>
+          <w:tcPr>
+            <w:tcW w:type="dxa" w:w="3888"/>
+            <w:shd w:fill="292129"/>
+            <w:vAlign w:val="center"/>
+          </w:tcPr>
+          <w:p>
+            <w:r>
+              <w:rPr>
+                <w:b/>
+                <w:color w:val="FFFFFF"/>
+                <w:sz w:val="18"/>
+              </w:rPr>
+              <w:t>Cara</w:t>
+            </w:r>
+          </w:p>
+        </w:tc>
+        <w:tc>
+          <w:tcPr>
+            <w:tcW w:type="dxa" w:w="3744"/>
+            <w:shd w:fill="292129"/>
+            <w:vAlign w:val="center"/>
+          </w:tcPr>
+          <w:p>
+            <w:r>
+              <w:rPr>
+                <w:b/>
+                <w:color w:val="FFFFFF"/>
+                <w:sz w:val="18"/>
+              </w:rPr>
+              <w:t>Catatan</w:t>
+            </w:r>
+          </w:p>
+        </w:tc>
+      </w:tr>
+      <w:tr>
+        <w:tc>
+          <w:tcPr>
+            <w:tcW w:type="dxa" w:w="1944"/>
+            <w:vAlign w:val="center"/>
+          </w:tcPr>
+          <w:p>
+            <w:pPr>
+              <w:spacing w:after="40"/>
+            </w:pPr>
+            <w:r>
+              <w:rPr>
+                <w:sz w:val="17"/>
+              </w:rPr>
+              <w:t>Tambah</w:t>
+            </w:r>
+          </w:p>
+        </w:tc>
+        <w:tc>
+          <w:tcPr>
+            <w:tcW w:type="dxa" w:w="3888"/>
+            <w:vAlign w:val="center"/>
+          </w:tcPr>
+          <w:p>
+            <w:pPr>
+              <w:spacing w:after="40"/>
+            </w:pPr>
+            <w:r>
+              <w:rPr>
+                <w:sz w:val="17"/>
+              </w:rPr>
+              <w:t>Klik New atau Create, isi form, lalu Save</w:t>
+            </w:r>
+          </w:p>
+        </w:tc>
+        <w:tc>
+          <w:tcPr>
+            <w:tcW w:type="dxa" w:w="3744"/>
+            <w:vAlign w:val="center"/>
+          </w:tcPr>
+          <w:p>
+            <w:pPr>
+              <w:spacing w:after="40"/>
+            </w:pPr>
+            <w:r>
+              <w:rPr>
+                <w:sz w:val="17"/>
+              </w:rPr>
+              <w:t>Gunakan slug unik</w:t>
+            </w:r>
+          </w:p>
+        </w:tc>
+      </w:tr>
+      <w:tr>
+        <w:tc>
+          <w:tcPr>
+            <w:tcW w:type="dxa" w:w="1944"/>
+            <w:vAlign w:val="center"/>
+            <w:shd w:fill="F7F0F6"/>
+          </w:tcPr>
+          <w:p>
+            <w:pPr>
+              <w:spacing w:after="40"/>
+            </w:pPr>
+            <w:r>
+              <w:rPr>
+                <w:sz w:val="17"/>
+              </w:rPr>
+              <w:t>Edit</w:t>
+            </w:r>
+          </w:p>
+        </w:tc>
+        <w:tc>
+          <w:tcPr>
+            <w:tcW w:type="dxa" w:w="3888"/>
+            <w:vAlign w:val="center"/>
+            <w:shd w:fill="F7F0F6"/>
+          </w:tcPr>
+          <w:p>
+            <w:pPr>
+              <w:spacing w:after="40"/>
+            </w:pPr>
+            <w:r>
+              <w:rPr>
+                <w:sz w:val="17"/>
+              </w:rPr>
+              <w:t>Klik Edit pada baris yang dipilih</w:t>
+            </w:r>
+          </w:p>
+        </w:tc>
+        <w:tc>
+          <w:tcPr>
+            <w:tcW w:type="dxa" w:w="3744"/>
+            <w:vAlign w:val="center"/>
+            <w:shd w:fill="F7F0F6"/>
+          </w:tcPr>
+          <w:p>
+            <w:pPr>
+              <w:spacing w:after="40"/>
+            </w:pPr>
+            <w:r>
+              <w:rPr>
+                <w:sz w:val="17"/>
+              </w:rPr>
+              <w:t>Periksa kedua bahasa</w:t>
+            </w:r>
+          </w:p>
+        </w:tc>
+      </w:tr>
+      <w:tr>
+        <w:tc>
+          <w:tcPr>
+            <w:tcW w:type="dxa" w:w="1944"/>
+            <w:vAlign w:val="center"/>
+          </w:tcPr>
+          <w:p>
+            <w:pPr>
+              <w:spacing w:after="40"/>
+            </w:pPr>
+            <w:r>
+              <w:rPr>
+                <w:sz w:val="17"/>
+              </w:rPr>
+              <w:t>Hapus</w:t>
+            </w:r>
+          </w:p>
+        </w:tc>
+        <w:tc>
+          <w:tcPr>
+            <w:tcW w:type="dxa" w:w="3888"/>
+            <w:vAlign w:val="center"/>
+          </w:tcPr>
+          <w:p>
+            <w:pPr>
+              <w:spacing w:after="40"/>
+            </w:pPr>
+            <w:r>
+              <w:rPr>
+                <w:sz w:val="17"/>
+              </w:rPr>
+              <w:t>Klik Delete lalu konfirmasi</w:t>
+            </w:r>
+          </w:p>
+        </w:tc>
+        <w:tc>
+          <w:tcPr>
+            <w:tcW w:type="dxa" w:w="3744"/>
+            <w:vAlign w:val="center"/>
+          </w:tcPr>
+          <w:p>
+            <w:pPr>
+              <w:spacing w:after="40"/>
+            </w:pPr>
+            <w:r>
+              <w:rPr>
+                <w:sz w:val="17"/>
+              </w:rPr>
+              <w:t>Penghapusan tidak mudah dibatalkan</w:t>
+            </w:r>
+          </w:p>
+        </w:tc>
+      </w:tr>
+      <w:tr>
+        <w:tc>
+          <w:tcPr>
+            <w:tcW w:type="dxa" w:w="1944"/>
+            <w:vAlign w:val="center"/>
+            <w:shd w:fill="F7F0F6"/>
+          </w:tcPr>
+          <w:p>
+            <w:pPr>
+              <w:spacing w:after="40"/>
+            </w:pPr>
+            <w:r>
+              <w:rPr>
+                <w:sz w:val="17"/>
+              </w:rPr>
+              <w:t>Terbitkan massal</w:t>
+            </w:r>
+          </w:p>
+        </w:tc>
+        <w:tc>
+          <w:tcPr>
+            <w:tcW w:type="dxa" w:w="3888"/>
+            <w:vAlign w:val="center"/>
+            <w:shd w:fill="F7F0F6"/>
+          </w:tcPr>
+          <w:p>
+            <w:pPr>
+              <w:spacing w:after="40"/>
+            </w:pPr>
+            <w:r>
+              <w:rPr>
+                <w:sz w:val="17"/>
+              </w:rPr>
+              <w:t>Centang baris lalu pilih Terbitkan</w:t>
+            </w:r>
+          </w:p>
+        </w:tc>
+        <w:tc>
+          <w:tcPr>
+            <w:tcW w:type="dxa" w:w="3744"/>
+            <w:vAlign w:val="center"/>
+            <w:shd w:fill="F7F0F6"/>
+          </w:tcPr>
+          <w:p>
+            <w:pPr>
+              <w:spacing w:after="40"/>
+            </w:pPr>
+            <w:r>
+              <w:rPr>
+                <w:sz w:val="17"/>
+              </w:rPr>
+              <w:t>Tersedia pada layanan, artikel, FAQ, dan survei</w:t>
+            </w:r>
+          </w:p>
+        </w:tc>
+      </w:tr>
+      <w:tr>
+        <w:tc>
+          <w:tcPr>
+            <w:tcW w:type="dxa" w:w="1944"/>
+            <w:vAlign w:val="center"/>
+          </w:tcPr>
+          <w:p>
+            <w:pPr>
+              <w:spacing w:after="40"/>
+            </w:pPr>
+            <w:r>
+              <w:rPr>
+                <w:sz w:val="17"/>
+              </w:rPr>
+              <w:t>Batalkan terbit massal</w:t>
+            </w:r>
+          </w:p>
+        </w:tc>
+        <w:tc>
+          <w:tcPr>
+            <w:tcW w:type="dxa" w:w="3888"/>
+            <w:vAlign w:val="center"/>
+          </w:tcPr>
+          <w:p>
+            <w:pPr>
+              <w:spacing w:after="40"/>
+            </w:pPr>
+            <w:r>
+              <w:rPr>
+                <w:sz w:val="17"/>
+              </w:rPr>
+              <w:t>Centang baris lalu pilih Batalkan terbit</w:t>
+            </w:r>
+          </w:p>
+        </w:tc>
+        <w:tc>
+          <w:tcPr>
+            <w:tcW w:type="dxa" w:w="3744"/>
+            <w:vAlign w:val="center"/>
+          </w:tcPr>
+          <w:p>
+            <w:pPr>
+              <w:spacing w:after="40"/>
+            </w:pPr>
+            <w:r>
+              <w:rPr>
+                <w:sz w:val="17"/>
+              </w:rPr>
+              <w:t>Konten hilang dari halaman publik</w:t>
+            </w:r>
+          </w:p>
+        </w:tc>
+      </w:tr>
+      <w:tr>
+        <w:tc>
+          <w:tcPr>
+            <w:tcW w:type="dxa" w:w="1944"/>
+            <w:vAlign w:val="center"/>
+            <w:shd w:fill="F7F0F6"/>
+          </w:tcPr>
+          <w:p>
+            <w:pPr>
+              <w:spacing w:after="40"/>
+            </w:pPr>
+            <w:r>
+              <w:rPr>
+                <w:sz w:val="17"/>
+              </w:rPr>
+              <w:t>Cari dan filter</w:t>
+            </w:r>
+          </w:p>
+        </w:tc>
+        <w:tc>
+          <w:tcPr>
+            <w:tcW w:type="dxa" w:w="3888"/>
+            <w:vAlign w:val="center"/>
+            <w:shd w:fill="F7F0F6"/>
+          </w:tcPr>
+          <w:p>
+            <w:pPr>
+              <w:spacing w:after="40"/>
+            </w:pPr>
+            <w:r>
+              <w:rPr>
+                <w:sz w:val="17"/>
+              </w:rPr>
+              <w:t>Gunakan pencarian atau filter tabel</w:t>
+            </w:r>
+          </w:p>
+        </w:tc>
+        <w:tc>
+          <w:tcPr>
+            <w:tcW w:type="dxa" w:w="3744"/>
+            <w:vAlign w:val="center"/>
+            <w:shd w:fill="F7F0F6"/>
+          </w:tcPr>
+          <w:p>
+            <w:pPr>
+              <w:spacing w:after="40"/>
+            </w:pPr>
+            <w:r>
+              <w:rPr>
+                <w:sz w:val="17"/>
+              </w:rPr>
+              <w:t>Tidak mengubah data</w:t>
+            </w:r>
+          </w:p>
+        </w:tc>
+      </w:tr>
+    </w:tbl>
+    <w:p/>
     <w:p>
       <w:pPr>
         <w:pStyle w:val="Heading1"/>
       </w:pPr>
       <w:r>
-        <w:t>4. Operasi CRUD Umum</w:t>
-      </w:r>
-    </w:p>
-    <w:p>
-      <w:pPr>
-        <w:pStyle w:val="ListBullet"/>
-      </w:pPr>
-      <w:r>
-        <w:t>Tambah: buka menu resource, klik New/Create, lengkapi form, lalu simpan.</w:t>
-      </w:r>
-    </w:p>
-    <w:p>
-      <w:pPr>
-        <w:pStyle w:val="ListBullet"/>
-      </w:pPr>
-      <w:r>
-        <w:t>Lihat: gunakan tabel, pencarian, filter, dan pagination.</w:t>
-      </w:r>
-    </w:p>
-    <w:p>
-      <w:pPr>
-        <w:pStyle w:val="ListBullet"/>
-      </w:pPr>
-      <w:r>
-        <w:t>Edit: klik Edit pada baris, ubah field, lalu Save.</w:t>
-      </w:r>
-    </w:p>
-    <w:p>
-      <w:pPr>
-        <w:pStyle w:val="ListBullet"/>
-      </w:pPr>
-      <w:r>
-        <w:t>Hapus: klik Delete pada baris dan konfirmasi. Untuk banyak data, centang baris lalu gunakan bulk delete.</w:t>
-      </w:r>
-    </w:p>
-    <w:p>
-      <w:pPr>
-        <w:pStyle w:val="ListBullet"/>
-      </w:pPr>
-      <w:r>
-        <w:t>Publikasi: nyalakan Terbit/Aktif. Untuk artikel dan layanan, atur waktu terbit bila diperlukan.</w:t>
-      </w:r>
-    </w:p>
-    <w:p>
-      <w:pPr>
-        <w:pStyle w:val="ListBullet"/>
-      </w:pPr>
-      <w:r>
-        <w:t>Draft: matikan Terbit agar konten tidak tampil publik.</w:t>
-      </w:r>
-    </w:p>
-    <w:p>
-      <w:pPr>
-        <w:pStyle w:val="Heading1"/>
-      </w:pPr>
-      <w:r>
-        <w:t>5. Mengelola Bahasa Indonesia dan Inggris</w:t>
-      </w:r>
-    </w:p>
-    <w:p>
-      <w:r>
-        <w:t>Isi tab Indonesia dan English pada record yang sama. Website memilih field English ketika pengguna memilih EN. Jika field English kosong, sistem memakai teks Indonesia sebagai fallback agar halaman tidak rusak. Untuk website bilingual yang baik, jangan biarkan tab English kosong.</w:t>
-      </w:r>
-    </w:p>
-    <w:p>
-      <w:pPr>
-        <w:pStyle w:val="Heading1"/>
-      </w:pPr>
-      <w:r>
-        <w:t>6. Menu Admin</w:t>
+        <w:t>Mengelola kategori dan layanan</w:t>
       </w:r>
     </w:p>
     <w:p>
@@ -167,12 +1052,12 @@
         <w:pStyle w:val="Heading2"/>
       </w:pPr>
       <w:r>
-        <w:t>Kategori Layanan</w:t>
+        <w:t>Kategori layanan</w:t>
       </w:r>
     </w:p>
     <w:p>
       <w:r>
-        <w:t>Mengatur kelompok layanan. Kategori yang masih memiliki layanan tidak dapat dihapus untuk menjaga integritas data.</w:t>
+        <w:t>Buat kategori lebih dahulu karena setiap layanan wajib terkait ke satu category_slug. Kategori yang masih mempunyai layanan tidak dapat dihapus. Kolom utama adalah nama ID/EN, slug, deskripsi ID/EN, urutan, dan status unggulan.</w:t>
       </w:r>
     </w:p>
     <w:p>
@@ -185,7 +1070,47 @@
     </w:p>
     <w:p>
       <w:r>
-        <w:t>Mengatur judul, ringkasan, sasaran, syarat, dokumen, prosedur, CTA, URL, lokasi, jam, estimasi, biaya, unit, gambar, SEO, dan publikasi.</w:t>
+        <w:t>Form layanan berisi identitas, konten ID/EN, persyaratan, dokumen, prosedur, informasi operasional, SEO, gambar, publikasi, dan tombol kontak.</w:t>
+      </w:r>
+    </w:p>
+    <w:p>
+      <w:pPr>
+        <w:pStyle w:val="ListBullet"/>
+      </w:pPr>
+      <w:r>
+        <w:t>delivery_type harus online, offline, atau hybrid.</w:t>
+      </w:r>
+    </w:p>
+    <w:p>
+      <w:pPr>
+        <w:pStyle w:val="ListBullet"/>
+      </w:pPr>
+      <w:r>
+        <w:t>Tombol kontak minimal satu. Default-nya Hubungi Admin ULT ke WhatsApp aktif.</w:t>
+      </w:r>
+    </w:p>
+    <w:p>
+      <w:pPr>
+        <w:pStyle w:val="ListBullet"/>
+      </w:pPr>
+      <w:r>
+        <w:t>Admin dapat mengubah label ID/EN, kanal, URL, urutan, serta menambahkan tombol Helpdesk, email, telepon, website, atau kanal lain.</w:t>
+      </w:r>
+    </w:p>
+    <w:p>
+      <w:pPr>
+        <w:pStyle w:val="ListBullet"/>
+      </w:pPr>
+      <w:r>
+        <w:t>Jika URL kontak global berubah, perbarui menu Kontak dan tombol layanan yang menyimpan URL lama.</w:t>
+      </w:r>
+    </w:p>
+    <w:p>
+      <w:pPr>
+        <w:pStyle w:val="Heading1"/>
+      </w:pPr>
+      <w:r>
+        <w:t>Mengelola artikel dan FAQ</w:t>
       </w:r>
     </w:p>
     <w:p>
@@ -198,7 +1123,7 @@
     </w:p>
     <w:p>
       <w:r>
-        <w:t>Mengatur artikel ID/EN, kategori, ringkasan, isi, penulis, gambar, SEO, unggulan, dan waktu terbit.</w:t>
+        <w:t>Isi judul, kategori, ringkasan, konten, penulis, pemilik konten, gambar, deskripsi SEO, dan bahasa Inggris. external_url bersifat opsional; jika diisi, external_label menjadi tombol pada akhir artikel. Artikel unggulan dapat muncul pada carousel beranda.</w:t>
       </w:r>
     </w:p>
     <w:p>
@@ -211,7 +1136,46 @@
     </w:p>
     <w:p>
       <w:r>
-        <w:t>Mengatur pertanyaan dan jawaban ID/EN, kategori, urutan, unggulan, dan status terbit.</w:t>
+        <w:t>Isi pertanyaan, jawaban, kategori, sasaran, urutan, dan versi Inggris. external_url bersifat opsional; jika diisi, external_label menjadi tombol di bawah jawaban. is_featured menampilkan FAQ pada beranda.</w:t>
+      </w:r>
+    </w:p>
+    <w:p>
+      <w:pPr>
+        <w:pStyle w:val="Heading1"/>
+      </w:pPr>
+      <w:r>
+        <w:t>Mengelola survei kepuasan</w:t>
+      </w:r>
+    </w:p>
+    <w:p>
+      <w:r>
+        <w:t>Satu record mewakili satu tahun dan tahun harus unik. Isi skor Triwulan 1 sampai 4 dalam rentang 0-100. source_url menghasilkan tombol Lihat data asli, sedangkan questionnaire_url menghasilkan tombol Kuesioner survei kepuasan masyarakat. Skor kosong ditampilkan sebagai data belum tersedia.</w:t>
+      </w:r>
+    </w:p>
+    <w:p>
+      <w:pPr>
+        <w:pStyle w:val="Heading1"/>
+      </w:pPr>
+      <w:r>
+        <w:t>Mengelola kontak dan tautan cepat</w:t>
+      </w:r>
+    </w:p>
+    <w:p>
+      <w:r>
+        <w:t>Kontak mendukung email, phone, whatsapp, helpdesk, instagram, tiktok, address, dan other. Gunakan URL lengkap dengan https://. Tautan sosial aktif tampil di footer; semua kontak aktif tampil di halaman Kontak. Tautan Cepat berisi nama ID/EN, deskripsi ID/EN, URL, urutan, dan status aktif.</w:t>
+      </w:r>
+    </w:p>
+    <w:p>
+      <w:pPr>
+        <w:pStyle w:val="Heading1"/>
+      </w:pPr>
+      <w:r>
+        <w:t>Impor dataset CSV</w:t>
+      </w:r>
+    </w:p>
+    <w:p>
+      <w:r>
+        <w:t>Impor tersedia untuk Layanan, Artikel, dan FAQ. Gunakan UTF-8, pemisah koma, satu baris header, dan satu record per baris. Jangan mengubah nama header. Simpan teks yang mengandung koma atau HTML di dalam tanda kutip ganda. Nilai boolean menerima 1, true, ya, yes, publish, atau published sebagai benar; gunakan 0 untuk draft.</w:t>
       </w:r>
     </w:p>
     <w:p>
@@ -219,12 +1183,394 @@
         <w:pStyle w:val="Heading2"/>
       </w:pPr>
       <w:r>
-        <w:t>Kontak</w:t>
+        <w:t>CSV layanan</w:t>
       </w:r>
     </w:p>
     <w:p>
       <w:r>
-        <w:t>Mengatur WhatsApp, helpdesk, Instagram, TikTok, email, telepon, alamat, URL, deskripsi, dan urutan.</w:t>
+        <w:t>Template: docs/service-import-template.csv</w:t>
+      </w:r>
+    </w:p>
+    <w:p>
+      <w:r>
+        <w:t>Kolom wajib: category_slug, title, summary.</w:t>
+      </w:r>
+    </w:p>
+    <w:tbl>
+      <w:tblPr>
+        <w:tblStyle w:val="TableGrid"/>
+        <w:tblW w:type="auto" w:w="0"/>
+        <w:tblLayout w:type="fixed"/>
+        <w:tblLook w:firstColumn="1" w:firstRow="1" w:lastColumn="0" w:lastRow="0" w:noHBand="0" w:noVBand="1" w:val="04A0"/>
+        <w:tblBorders>
+          <w:top w:val="single" w:sz="4" w:color="D9D9D9"/>
+          <w:left w:val="single" w:sz="4" w:color="D9D9D9"/>
+          <w:bottom w:val="single" w:sz="4" w:color="D9D9D9"/>
+          <w:right w:val="single" w:sz="4" w:color="D9D9D9"/>
+          <w:insideH w:val="single" w:sz="4" w:color="D9D9D9"/>
+          <w:insideV w:val="single" w:sz="4" w:color="D9D9D9"/>
+        </w:tblBorders>
+      </w:tblPr>
+      <w:tblGrid>
+        <w:gridCol w:w="4997"/>
+        <w:gridCol w:w="4997"/>
+      </w:tblGrid>
+      <w:tr>
+        <w:tc>
+          <w:tcPr>
+            <w:tcW w:type="dxa" w:w="3168"/>
+            <w:shd w:fill="292129"/>
+            <w:vAlign w:val="center"/>
+          </w:tcPr>
+          <w:p>
+            <w:r>
+              <w:rPr>
+                <w:b/>
+                <w:color w:val="FFFFFF"/>
+                <w:sz w:val="18"/>
+              </w:rPr>
+              <w:t>Kolom</w:t>
+            </w:r>
+          </w:p>
+        </w:tc>
+        <w:tc>
+          <w:tcPr>
+            <w:tcW w:type="dxa" w:w="6336"/>
+            <w:shd w:fill="292129"/>
+            <w:vAlign w:val="center"/>
+          </w:tcPr>
+          <w:p>
+            <w:r>
+              <w:rPr>
+                <w:b/>
+                <w:color w:val="FFFFFF"/>
+                <w:sz w:val="18"/>
+              </w:rPr>
+              <w:t>Kegunaan</w:t>
+            </w:r>
+          </w:p>
+        </w:tc>
+      </w:tr>
+      <w:tr>
+        <w:tc>
+          <w:tcPr>
+            <w:tcW w:type="dxa" w:w="3168"/>
+            <w:vAlign w:val="center"/>
+          </w:tcPr>
+          <w:p>
+            <w:pPr>
+              <w:spacing w:after="40"/>
+            </w:pPr>
+            <w:r>
+              <w:rPr>
+                <w:sz w:val="17"/>
+              </w:rPr>
+              <w:t>category_slug</w:t>
+            </w:r>
+          </w:p>
+        </w:tc>
+        <w:tc>
+          <w:tcPr>
+            <w:tcW w:type="dxa" w:w="6336"/>
+            <w:vAlign w:val="center"/>
+          </w:tcPr>
+          <w:p>
+            <w:pPr>
+              <w:spacing w:after="40"/>
+            </w:pPr>
+            <w:r>
+              <w:rPr>
+                <w:sz w:val="17"/>
+              </w:rPr>
+              <w:t>Slug kategori yang sudah tersedia di admin</w:t>
+            </w:r>
+          </w:p>
+        </w:tc>
+      </w:tr>
+      <w:tr>
+        <w:tc>
+          <w:tcPr>
+            <w:tcW w:type="dxa" w:w="3168"/>
+            <w:vAlign w:val="center"/>
+            <w:shd w:fill="F7F0F6"/>
+          </w:tcPr>
+          <w:p>
+            <w:pPr>
+              <w:spacing w:after="40"/>
+            </w:pPr>
+            <w:r>
+              <w:rPr>
+                <w:sz w:val="17"/>
+              </w:rPr>
+              <w:t>slug</w:t>
+            </w:r>
+          </w:p>
+        </w:tc>
+        <w:tc>
+          <w:tcPr>
+            <w:tcW w:type="dxa" w:w="6336"/>
+            <w:vAlign w:val="center"/>
+            <w:shd w:fill="F7F0F6"/>
+          </w:tcPr>
+          <w:p>
+            <w:pPr>
+              <w:spacing w:after="40"/>
+            </w:pPr>
+            <w:r>
+              <w:rPr>
+                <w:sz w:val="17"/>
+              </w:rPr>
+              <w:t>Identitas URL unik; jika kosong dibuat dari title</w:t>
+            </w:r>
+          </w:p>
+        </w:tc>
+      </w:tr>
+      <w:tr>
+        <w:tc>
+          <w:tcPr>
+            <w:tcW w:type="dxa" w:w="3168"/>
+            <w:vAlign w:val="center"/>
+          </w:tcPr>
+          <w:p>
+            <w:pPr>
+              <w:spacing w:after="40"/>
+            </w:pPr>
+            <w:r>
+              <w:rPr>
+                <w:sz w:val="17"/>
+              </w:rPr>
+              <w:t>delivery_type</w:t>
+            </w:r>
+          </w:p>
+        </w:tc>
+        <w:tc>
+          <w:tcPr>
+            <w:tcW w:type="dxa" w:w="6336"/>
+            <w:vAlign w:val="center"/>
+          </w:tcPr>
+          <w:p>
+            <w:pPr>
+              <w:spacing w:after="40"/>
+            </w:pPr>
+            <w:r>
+              <w:rPr>
+                <w:sz w:val="17"/>
+              </w:rPr>
+              <w:t>online, offline, atau hybrid</w:t>
+            </w:r>
+          </w:p>
+        </w:tc>
+      </w:tr>
+      <w:tr>
+        <w:tc>
+          <w:tcPr>
+            <w:tcW w:type="dxa" w:w="3168"/>
+            <w:vAlign w:val="center"/>
+            <w:shd w:fill="F7F0F6"/>
+          </w:tcPr>
+          <w:p>
+            <w:pPr>
+              <w:spacing w:after="40"/>
+            </w:pPr>
+            <w:r>
+              <w:rPr>
+                <w:sz w:val="17"/>
+              </w:rPr>
+              <w:t>contact_1_label sampai contact_3_label</w:t>
+            </w:r>
+          </w:p>
+        </w:tc>
+        <w:tc>
+          <w:tcPr>
+            <w:tcW w:type="dxa" w:w="6336"/>
+            <w:vAlign w:val="center"/>
+            <w:shd w:fill="F7F0F6"/>
+          </w:tcPr>
+          <w:p>
+            <w:pPr>
+              <w:spacing w:after="40"/>
+            </w:pPr>
+            <w:r>
+              <w:rPr>
+                <w:sz w:val="17"/>
+              </w:rPr>
+              <w:t>Tulisan tombol kontak Indonesia</w:t>
+            </w:r>
+          </w:p>
+        </w:tc>
+      </w:tr>
+      <w:tr>
+        <w:tc>
+          <w:tcPr>
+            <w:tcW w:type="dxa" w:w="3168"/>
+            <w:vAlign w:val="center"/>
+          </w:tcPr>
+          <w:p>
+            <w:pPr>
+              <w:spacing w:after="40"/>
+            </w:pPr>
+            <w:r>
+              <w:rPr>
+                <w:sz w:val="17"/>
+              </w:rPr>
+              <w:t>contact_1_label_en sampai contact_3_label_en</w:t>
+            </w:r>
+          </w:p>
+        </w:tc>
+        <w:tc>
+          <w:tcPr>
+            <w:tcW w:type="dxa" w:w="6336"/>
+            <w:vAlign w:val="center"/>
+          </w:tcPr>
+          <w:p>
+            <w:pPr>
+              <w:spacing w:after="40"/>
+            </w:pPr>
+            <w:r>
+              <w:rPr>
+                <w:sz w:val="17"/>
+              </w:rPr>
+              <w:t>Tulisan tombol kontak English</w:t>
+            </w:r>
+          </w:p>
+        </w:tc>
+      </w:tr>
+      <w:tr>
+        <w:tc>
+          <w:tcPr>
+            <w:tcW w:type="dxa" w:w="3168"/>
+            <w:vAlign w:val="center"/>
+            <w:shd w:fill="F7F0F6"/>
+          </w:tcPr>
+          <w:p>
+            <w:pPr>
+              <w:spacing w:after="40"/>
+            </w:pPr>
+            <w:r>
+              <w:rPr>
+                <w:sz w:val="17"/>
+              </w:rPr>
+              <w:t>contact_1_channel sampai contact_3_channel</w:t>
+            </w:r>
+          </w:p>
+        </w:tc>
+        <w:tc>
+          <w:tcPr>
+            <w:tcW w:type="dxa" w:w="6336"/>
+            <w:vAlign w:val="center"/>
+            <w:shd w:fill="F7F0F6"/>
+          </w:tcPr>
+          <w:p>
+            <w:pPr>
+              <w:spacing w:after="40"/>
+            </w:pPr>
+            <w:r>
+              <w:rPr>
+                <w:sz w:val="17"/>
+              </w:rPr>
+              <w:t>whatsapp, helpdesk, email, phone, website, atau other</w:t>
+            </w:r>
+          </w:p>
+        </w:tc>
+      </w:tr>
+      <w:tr>
+        <w:tc>
+          <w:tcPr>
+            <w:tcW w:type="dxa" w:w="3168"/>
+            <w:vAlign w:val="center"/>
+          </w:tcPr>
+          <w:p>
+            <w:pPr>
+              <w:spacing w:after="40"/>
+            </w:pPr>
+            <w:r>
+              <w:rPr>
+                <w:sz w:val="17"/>
+              </w:rPr>
+              <w:t>contact_1_url sampai contact_3_url</w:t>
+            </w:r>
+          </w:p>
+        </w:tc>
+        <w:tc>
+          <w:tcPr>
+            <w:tcW w:type="dxa" w:w="6336"/>
+            <w:vAlign w:val="center"/>
+          </w:tcPr>
+          <w:p>
+            <w:pPr>
+              <w:spacing w:after="40"/>
+            </w:pPr>
+            <w:r>
+              <w:rPr>
+                <w:sz w:val="17"/>
+              </w:rPr>
+              <w:t>URL lengkap tujuan tombol</w:t>
+            </w:r>
+          </w:p>
+        </w:tc>
+      </w:tr>
+      <w:tr>
+        <w:tc>
+          <w:tcPr>
+            <w:tcW w:type="dxa" w:w="3168"/>
+            <w:vAlign w:val="center"/>
+            <w:shd w:fill="F7F0F6"/>
+          </w:tcPr>
+          <w:p>
+            <w:pPr>
+              <w:spacing w:after="40"/>
+            </w:pPr>
+            <w:r>
+              <w:rPr>
+                <w:sz w:val="17"/>
+              </w:rPr>
+              <w:t>is_featured dan is_published</w:t>
+            </w:r>
+          </w:p>
+        </w:tc>
+        <w:tc>
+          <w:tcPr>
+            <w:tcW w:type="dxa" w:w="6336"/>
+            <w:vAlign w:val="center"/>
+            <w:shd w:fill="F7F0F6"/>
+          </w:tcPr>
+          <w:p>
+            <w:pPr>
+              <w:spacing w:after="40"/>
+            </w:pPr>
+            <w:r>
+              <w:rPr>
+                <w:sz w:val="17"/>
+              </w:rPr>
+              <w:t>1 untuk aktif, 0 untuk tidak aktif</w:t>
+            </w:r>
+          </w:p>
+        </w:tc>
+      </w:tr>
+    </w:tbl>
+    <w:p/>
+    <w:p>
+      <w:pPr>
+        <w:pStyle w:val="ListBullet"/>
+      </w:pPr>
+      <w:r>
+        <w:t>Buat kategori sebelum impor dan salin slug persis dari menu Kategori Layanan.</w:t>
+      </w:r>
+    </w:p>
+    <w:p>
+      <w:pPr>
+        <w:pStyle w:val="ListBullet"/>
+      </w:pPr>
+      <w:r>
+        <w:t>Jika semua contact_N_url kosong, sistem otomatis membuat tombol WhatsApp Admin ULT.</w:t>
+      </w:r>
+    </w:p>
+    <w:p>
+      <w:pPr>
+        <w:pStyle w:val="ListBullet"/>
+      </w:pPr>
+      <w:r>
+        <w:t>Impor dengan slug yang sudah ada akan memperbarui layanan tersebut.</w:t>
       </w:r>
     </w:p>
     <w:p>
@@ -232,12 +1578,673 @@
         <w:pStyle w:val="Heading2"/>
       </w:pPr>
       <w:r>
-        <w:t>Tautan Cepat</w:t>
+        <w:t>CSV artikel</w:t>
       </w:r>
     </w:p>
     <w:p>
       <w:r>
-        <w:t>Mengatur portal resmi beserta nama/deskripsi ID/EN dan URL.</w:t>
+        <w:t>Template: docs/article-import-template.csv</w:t>
+      </w:r>
+    </w:p>
+    <w:p>
+      <w:r>
+        <w:t>Kolom wajib: title, category, excerpt, content.</w:t>
+      </w:r>
+    </w:p>
+    <w:tbl>
+      <w:tblPr>
+        <w:tblStyle w:val="TableGrid"/>
+        <w:tblW w:type="auto" w:w="0"/>
+        <w:tblLayout w:type="fixed"/>
+        <w:tblLook w:firstColumn="1" w:firstRow="1" w:lastColumn="0" w:lastRow="0" w:noHBand="0" w:noVBand="1" w:val="04A0"/>
+        <w:tblBorders>
+          <w:top w:val="single" w:sz="4" w:color="D9D9D9"/>
+          <w:left w:val="single" w:sz="4" w:color="D9D9D9"/>
+          <w:bottom w:val="single" w:sz="4" w:color="D9D9D9"/>
+          <w:right w:val="single" w:sz="4" w:color="D9D9D9"/>
+          <w:insideH w:val="single" w:sz="4" w:color="D9D9D9"/>
+          <w:insideV w:val="single" w:sz="4" w:color="D9D9D9"/>
+        </w:tblBorders>
+      </w:tblPr>
+      <w:tblGrid>
+        <w:gridCol w:w="4997"/>
+        <w:gridCol w:w="4997"/>
+      </w:tblGrid>
+      <w:tr>
+        <w:tc>
+          <w:tcPr>
+            <w:tcW w:type="dxa" w:w="3168"/>
+            <w:shd w:fill="292129"/>
+            <w:vAlign w:val="center"/>
+          </w:tcPr>
+          <w:p>
+            <w:r>
+              <w:rPr>
+                <w:b/>
+                <w:color w:val="FFFFFF"/>
+                <w:sz w:val="18"/>
+              </w:rPr>
+              <w:t>Kolom</w:t>
+            </w:r>
+          </w:p>
+        </w:tc>
+        <w:tc>
+          <w:tcPr>
+            <w:tcW w:type="dxa" w:w="6336"/>
+            <w:shd w:fill="292129"/>
+            <w:vAlign w:val="center"/>
+          </w:tcPr>
+          <w:p>
+            <w:r>
+              <w:rPr>
+                <w:b/>
+                <w:color w:val="FFFFFF"/>
+                <w:sz w:val="18"/>
+              </w:rPr>
+              <w:t>Kegunaan</w:t>
+            </w:r>
+          </w:p>
+        </w:tc>
+      </w:tr>
+      <w:tr>
+        <w:tc>
+          <w:tcPr>
+            <w:tcW w:type="dxa" w:w="3168"/>
+            <w:vAlign w:val="center"/>
+          </w:tcPr>
+          <w:p>
+            <w:pPr>
+              <w:spacing w:after="40"/>
+            </w:pPr>
+            <w:r>
+              <w:rPr>
+                <w:sz w:val="17"/>
+              </w:rPr>
+              <w:t>slug</w:t>
+            </w:r>
+          </w:p>
+        </w:tc>
+        <w:tc>
+          <w:tcPr>
+            <w:tcW w:type="dxa" w:w="6336"/>
+            <w:vAlign w:val="center"/>
+          </w:tcPr>
+          <w:p>
+            <w:pPr>
+              <w:spacing w:after="40"/>
+            </w:pPr>
+            <w:r>
+              <w:rPr>
+                <w:sz w:val="17"/>
+              </w:rPr>
+              <w:t>URL unik; jika kosong dibuat dari title</w:t>
+            </w:r>
+          </w:p>
+        </w:tc>
+      </w:tr>
+      <w:tr>
+        <w:tc>
+          <w:tcPr>
+            <w:tcW w:type="dxa" w:w="3168"/>
+            <w:vAlign w:val="center"/>
+            <w:shd w:fill="F7F0F6"/>
+          </w:tcPr>
+          <w:p>
+            <w:pPr>
+              <w:spacing w:after="40"/>
+            </w:pPr>
+            <w:r>
+              <w:rPr>
+                <w:sz w:val="17"/>
+              </w:rPr>
+              <w:t>content dan content_en</w:t>
+            </w:r>
+          </w:p>
+        </w:tc>
+        <w:tc>
+          <w:tcPr>
+            <w:tcW w:type="dxa" w:w="6336"/>
+            <w:vAlign w:val="center"/>
+            <w:shd w:fill="F7F0F6"/>
+          </w:tcPr>
+          <w:p>
+            <w:pPr>
+              <w:spacing w:after="40"/>
+            </w:pPr>
+            <w:r>
+              <w:rPr>
+                <w:sz w:val="17"/>
+              </w:rPr>
+              <w:t>HTML aman seperti p, ol, ul, li, strong, dan link</w:t>
+            </w:r>
+          </w:p>
+        </w:tc>
+      </w:tr>
+      <w:tr>
+        <w:tc>
+          <w:tcPr>
+            <w:tcW w:type="dxa" w:w="3168"/>
+            <w:vAlign w:val="center"/>
+          </w:tcPr>
+          <w:p>
+            <w:pPr>
+              <w:spacing w:after="40"/>
+            </w:pPr>
+            <w:r>
+              <w:rPr>
+                <w:sz w:val="17"/>
+              </w:rPr>
+              <w:t>external_url</w:t>
+            </w:r>
+          </w:p>
+        </w:tc>
+        <w:tc>
+          <w:tcPr>
+            <w:tcW w:type="dxa" w:w="6336"/>
+            <w:vAlign w:val="center"/>
+          </w:tcPr>
+          <w:p>
+            <w:pPr>
+              <w:spacing w:after="40"/>
+            </w:pPr>
+            <w:r>
+              <w:rPr>
+                <w:sz w:val="17"/>
+              </w:rPr>
+              <w:t>Opsional; menampilkan tombol eksternal</w:t>
+            </w:r>
+          </w:p>
+        </w:tc>
+      </w:tr>
+      <w:tr>
+        <w:tc>
+          <w:tcPr>
+            <w:tcW w:type="dxa" w:w="3168"/>
+            <w:vAlign w:val="center"/>
+            <w:shd w:fill="F7F0F6"/>
+          </w:tcPr>
+          <w:p>
+            <w:pPr>
+              <w:spacing w:after="40"/>
+            </w:pPr>
+            <w:r>
+              <w:rPr>
+                <w:sz w:val="17"/>
+              </w:rPr>
+              <w:t>external_label dan external_label_en</w:t>
+            </w:r>
+          </w:p>
+        </w:tc>
+        <w:tc>
+          <w:tcPr>
+            <w:tcW w:type="dxa" w:w="6336"/>
+            <w:vAlign w:val="center"/>
+            <w:shd w:fill="F7F0F6"/>
+          </w:tcPr>
+          <w:p>
+            <w:pPr>
+              <w:spacing w:after="40"/>
+            </w:pPr>
+            <w:r>
+              <w:rPr>
+                <w:sz w:val="17"/>
+              </w:rPr>
+              <w:t>Tulisan tombol eksternal</w:t>
+            </w:r>
+          </w:p>
+        </w:tc>
+      </w:tr>
+      <w:tr>
+        <w:tc>
+          <w:tcPr>
+            <w:tcW w:type="dxa" w:w="3168"/>
+            <w:vAlign w:val="center"/>
+          </w:tcPr>
+          <w:p>
+            <w:pPr>
+              <w:spacing w:after="40"/>
+            </w:pPr>
+            <w:r>
+              <w:rPr>
+                <w:sz w:val="17"/>
+              </w:rPr>
+              <w:t>seo_description</w:t>
+            </w:r>
+          </w:p>
+        </w:tc>
+        <w:tc>
+          <w:tcPr>
+            <w:tcW w:type="dxa" w:w="6336"/>
+            <w:vAlign w:val="center"/>
+          </w:tcPr>
+          <w:p>
+            <w:pPr>
+              <w:spacing w:after="40"/>
+            </w:pPr>
+            <w:r>
+              <w:rPr>
+                <w:sz w:val="17"/>
+              </w:rPr>
+              <w:t>Ringkasan untuk mesin pencari</w:t>
+            </w:r>
+          </w:p>
+        </w:tc>
+      </w:tr>
+      <w:tr>
+        <w:tc>
+          <w:tcPr>
+            <w:tcW w:type="dxa" w:w="3168"/>
+            <w:vAlign w:val="center"/>
+            <w:shd w:fill="F7F0F6"/>
+          </w:tcPr>
+          <w:p>
+            <w:pPr>
+              <w:spacing w:after="40"/>
+            </w:pPr>
+            <w:r>
+              <w:rPr>
+                <w:sz w:val="17"/>
+              </w:rPr>
+              <w:t>is_featured dan is_published</w:t>
+            </w:r>
+          </w:p>
+        </w:tc>
+        <w:tc>
+          <w:tcPr>
+            <w:tcW w:type="dxa" w:w="6336"/>
+            <w:vAlign w:val="center"/>
+            <w:shd w:fill="F7F0F6"/>
+          </w:tcPr>
+          <w:p>
+            <w:pPr>
+              <w:spacing w:after="40"/>
+            </w:pPr>
+            <w:r>
+              <w:rPr>
+                <w:sz w:val="17"/>
+              </w:rPr>
+              <w:t>1 untuk aktif, 0 untuk draft</w:t>
+            </w:r>
+          </w:p>
+        </w:tc>
+      </w:tr>
+    </w:tbl>
+    <w:p/>
+    <w:p>
+      <w:pPr>
+        <w:pStyle w:val="ListBullet"/>
+      </w:pPr>
+      <w:r>
+        <w:t>Impor dengan slug yang sama memperbarui artikel.</w:t>
+      </w:r>
+    </w:p>
+    <w:p>
+      <w:pPr>
+        <w:pStyle w:val="ListBullet"/>
+      </w:pPr>
+      <w:r>
+        <w:t>Gambar utama tetap diunggah melalui form admin setelah impor.</w:t>
+      </w:r>
+    </w:p>
+    <w:p>
+      <w:pPr>
+        <w:pStyle w:val="Heading2"/>
+      </w:pPr>
+      <w:r>
+        <w:t>CSV FAQ</w:t>
+      </w:r>
+    </w:p>
+    <w:p>
+      <w:r>
+        <w:t>Template: docs/faq-import-template.csv</w:t>
+      </w:r>
+    </w:p>
+    <w:p>
+      <w:r>
+        <w:t>Kolom wajib: question, answer, category.</w:t>
+      </w:r>
+    </w:p>
+    <w:tbl>
+      <w:tblPr>
+        <w:tblStyle w:val="TableGrid"/>
+        <w:tblW w:type="auto" w:w="0"/>
+        <w:tblLayout w:type="fixed"/>
+        <w:tblLook w:firstColumn="1" w:firstRow="1" w:lastColumn="0" w:lastRow="0" w:noHBand="0" w:noVBand="1" w:val="04A0"/>
+        <w:tblBorders>
+          <w:top w:val="single" w:sz="4" w:color="D9D9D9"/>
+          <w:left w:val="single" w:sz="4" w:color="D9D9D9"/>
+          <w:bottom w:val="single" w:sz="4" w:color="D9D9D9"/>
+          <w:right w:val="single" w:sz="4" w:color="D9D9D9"/>
+          <w:insideH w:val="single" w:sz="4" w:color="D9D9D9"/>
+          <w:insideV w:val="single" w:sz="4" w:color="D9D9D9"/>
+        </w:tblBorders>
+      </w:tblPr>
+      <w:tblGrid>
+        <w:gridCol w:w="4997"/>
+        <w:gridCol w:w="4997"/>
+      </w:tblGrid>
+      <w:tr>
+        <w:tc>
+          <w:tcPr>
+            <w:tcW w:type="dxa" w:w="3168"/>
+            <w:shd w:fill="292129"/>
+            <w:vAlign w:val="center"/>
+          </w:tcPr>
+          <w:p>
+            <w:r>
+              <w:rPr>
+                <w:b/>
+                <w:color w:val="FFFFFF"/>
+                <w:sz w:val="18"/>
+              </w:rPr>
+              <w:t>Kolom</w:t>
+            </w:r>
+          </w:p>
+        </w:tc>
+        <w:tc>
+          <w:tcPr>
+            <w:tcW w:type="dxa" w:w="6336"/>
+            <w:shd w:fill="292129"/>
+            <w:vAlign w:val="center"/>
+          </w:tcPr>
+          <w:p>
+            <w:r>
+              <w:rPr>
+                <w:b/>
+                <w:color w:val="FFFFFF"/>
+                <w:sz w:val="18"/>
+              </w:rPr>
+              <w:t>Kegunaan</w:t>
+            </w:r>
+          </w:p>
+        </w:tc>
+      </w:tr>
+      <w:tr>
+        <w:tc>
+          <w:tcPr>
+            <w:tcW w:type="dxa" w:w="3168"/>
+            <w:vAlign w:val="center"/>
+          </w:tcPr>
+          <w:p>
+            <w:pPr>
+              <w:spacing w:after="40"/>
+            </w:pPr>
+            <w:r>
+              <w:rPr>
+                <w:sz w:val="17"/>
+              </w:rPr>
+              <w:t>question</w:t>
+            </w:r>
+          </w:p>
+        </w:tc>
+        <w:tc>
+          <w:tcPr>
+            <w:tcW w:type="dxa" w:w="6336"/>
+            <w:vAlign w:val="center"/>
+          </w:tcPr>
+          <w:p>
+            <w:pPr>
+              <w:spacing w:after="40"/>
+            </w:pPr>
+            <w:r>
+              <w:rPr>
+                <w:sz w:val="17"/>
+              </w:rPr>
+              <w:t>Kunci pembaruan record; harus konsisten</w:t>
+            </w:r>
+          </w:p>
+        </w:tc>
+      </w:tr>
+      <w:tr>
+        <w:tc>
+          <w:tcPr>
+            <w:tcW w:type="dxa" w:w="3168"/>
+            <w:vAlign w:val="center"/>
+            <w:shd w:fill="F7F0F6"/>
+          </w:tcPr>
+          <w:p>
+            <w:pPr>
+              <w:spacing w:after="40"/>
+            </w:pPr>
+            <w:r>
+              <w:rPr>
+                <w:sz w:val="17"/>
+              </w:rPr>
+              <w:t>answer</w:t>
+            </w:r>
+          </w:p>
+        </w:tc>
+        <w:tc>
+          <w:tcPr>
+            <w:tcW w:type="dxa" w:w="6336"/>
+            <w:vAlign w:val="center"/>
+            <w:shd w:fill="F7F0F6"/>
+          </w:tcPr>
+          <w:p>
+            <w:pPr>
+              <w:spacing w:after="40"/>
+            </w:pPr>
+            <w:r>
+              <w:rPr>
+                <w:sz w:val="17"/>
+              </w:rPr>
+              <w:t>Jawaban Indonesia; HTML sederhana diperbolehkan</w:t>
+            </w:r>
+          </w:p>
+        </w:tc>
+      </w:tr>
+      <w:tr>
+        <w:tc>
+          <w:tcPr>
+            <w:tcW w:type="dxa" w:w="3168"/>
+            <w:vAlign w:val="center"/>
+          </w:tcPr>
+          <w:p>
+            <w:pPr>
+              <w:spacing w:after="40"/>
+            </w:pPr>
+            <w:r>
+              <w:rPr>
+                <w:sz w:val="17"/>
+              </w:rPr>
+              <w:t>audience</w:t>
+            </w:r>
+          </w:p>
+        </w:tc>
+        <w:tc>
+          <w:tcPr>
+            <w:tcW w:type="dxa" w:w="6336"/>
+            <w:vAlign w:val="center"/>
+          </w:tcPr>
+          <w:p>
+            <w:pPr>
+              <w:spacing w:after="40"/>
+            </w:pPr>
+            <w:r>
+              <w:rPr>
+                <w:sz w:val="17"/>
+              </w:rPr>
+              <w:t>Sasaran seperti Mahasiswa atau Umum</w:t>
+            </w:r>
+          </w:p>
+        </w:tc>
+      </w:tr>
+      <w:tr>
+        <w:tc>
+          <w:tcPr>
+            <w:tcW w:type="dxa" w:w="3168"/>
+            <w:vAlign w:val="center"/>
+            <w:shd w:fill="F7F0F6"/>
+          </w:tcPr>
+          <w:p>
+            <w:pPr>
+              <w:spacing w:after="40"/>
+            </w:pPr>
+            <w:r>
+              <w:rPr>
+                <w:sz w:val="17"/>
+              </w:rPr>
+              <w:t>external_url</w:t>
+            </w:r>
+          </w:p>
+        </w:tc>
+        <w:tc>
+          <w:tcPr>
+            <w:tcW w:type="dxa" w:w="6336"/>
+            <w:vAlign w:val="center"/>
+            <w:shd w:fill="F7F0F6"/>
+          </w:tcPr>
+          <w:p>
+            <w:pPr>
+              <w:spacing w:after="40"/>
+            </w:pPr>
+            <w:r>
+              <w:rPr>
+                <w:sz w:val="17"/>
+              </w:rPr>
+              <w:t>Opsional; menampilkan tombol link</w:t>
+            </w:r>
+          </w:p>
+        </w:tc>
+      </w:tr>
+      <w:tr>
+        <w:tc>
+          <w:tcPr>
+            <w:tcW w:type="dxa" w:w="3168"/>
+            <w:vAlign w:val="center"/>
+          </w:tcPr>
+          <w:p>
+            <w:pPr>
+              <w:spacing w:after="40"/>
+            </w:pPr>
+            <w:r>
+              <w:rPr>
+                <w:sz w:val="17"/>
+              </w:rPr>
+              <w:t>sort_order</w:t>
+            </w:r>
+          </w:p>
+        </w:tc>
+        <w:tc>
+          <w:tcPr>
+            <w:tcW w:type="dxa" w:w="6336"/>
+            <w:vAlign w:val="center"/>
+          </w:tcPr>
+          <w:p>
+            <w:pPr>
+              <w:spacing w:after="40"/>
+            </w:pPr>
+            <w:r>
+              <w:rPr>
+                <w:sz w:val="17"/>
+              </w:rPr>
+              <w:t>Angka urutan; angka kecil tampil lebih dahulu</w:t>
+            </w:r>
+          </w:p>
+        </w:tc>
+      </w:tr>
+      <w:tr>
+        <w:tc>
+          <w:tcPr>
+            <w:tcW w:type="dxa" w:w="3168"/>
+            <w:vAlign w:val="center"/>
+            <w:shd w:fill="F7F0F6"/>
+          </w:tcPr>
+          <w:p>
+            <w:pPr>
+              <w:spacing w:after="40"/>
+            </w:pPr>
+            <w:r>
+              <w:rPr>
+                <w:sz w:val="17"/>
+              </w:rPr>
+              <w:t>is_featured dan is_published</w:t>
+            </w:r>
+          </w:p>
+        </w:tc>
+        <w:tc>
+          <w:tcPr>
+            <w:tcW w:type="dxa" w:w="6336"/>
+            <w:vAlign w:val="center"/>
+            <w:shd w:fill="F7F0F6"/>
+          </w:tcPr>
+          <w:p>
+            <w:pPr>
+              <w:spacing w:after="40"/>
+            </w:pPr>
+            <w:r>
+              <w:rPr>
+                <w:sz w:val="17"/>
+              </w:rPr>
+              <w:t>1 untuk aktif, 0 untuk tidak aktif</w:t>
+            </w:r>
+          </w:p>
+        </w:tc>
+      </w:tr>
+    </w:tbl>
+    <w:p/>
+    <w:p>
+      <w:pPr>
+        <w:pStyle w:val="ListBullet"/>
+      </w:pPr>
+      <w:r>
+        <w:t>Impor dengan question yang sama memperbarui FAQ.</w:t>
+      </w:r>
+    </w:p>
+    <w:p>
+      <w:pPr>
+        <w:pStyle w:val="ListBullet"/>
+      </w:pPr>
+      <w:r>
+        <w:t>Periksa FAQ unggulan di beranda setelah impor.</w:t>
+      </w:r>
+    </w:p>
+    <w:p>
+      <w:pPr>
+        <w:pStyle w:val="Heading2"/>
+      </w:pPr>
+      <w:r>
+        <w:t>Validasi sebelum impor</w:t>
+      </w:r>
+    </w:p>
+    <w:p>
+      <w:pPr>
+        <w:pStyle w:val="ListBullet"/>
+      </w:pPr>
+      <w:r>
+        <w:t>Buka CSV di editor yang tidak mengubah format URL atau karakter UTF-8.</w:t>
+      </w:r>
+    </w:p>
+    <w:p>
+      <w:pPr>
+        <w:pStyle w:val="ListBullet"/>
+      </w:pPr>
+      <w:r>
+        <w:t>Pastikan jumlah kolom setiap baris sama dengan header.</w:t>
+      </w:r>
+    </w:p>
+    <w:p>
+      <w:pPr>
+        <w:pStyle w:val="ListBullet"/>
+      </w:pPr>
+      <w:r>
+        <w:t>Pastikan slug unik, category_slug valid, URL memakai https://, dan HTML memiliki tag penutup.</w:t>
+      </w:r>
+    </w:p>
+    <w:p>
+      <w:pPr>
+        <w:pStyle w:val="ListBullet"/>
+      </w:pPr>
+      <w:r>
+        <w:t>Impor sebagai draft terlebih dahulu, periksa hasil, lalu terbitkan secara massal.</w:t>
+      </w:r>
+    </w:p>
+    <w:p>
+      <w:pPr>
+        <w:pStyle w:val="ListBullet"/>
+      </w:pPr>
+      <w:r>
+        <w:t>Simpan salinan CSV sumber sebagai arsip perubahan.</w:t>
       </w:r>
     </w:p>
     <w:p>
@@ -245,63 +2252,12 @@
         <w:pStyle w:val="Heading1"/>
       </w:pPr>
       <w:r>
-        <w:t>7. Alur Kerja yang Disarankan</w:t>
+        <w:t>Gambar dan media</w:t>
       </w:r>
     </w:p>
     <w:p>
-      <w:pPr>
-        <w:pStyle w:val="ListNumber"/>
-      </w:pPr>
       <w:r>
-        <w:t>Buat atau edit konten sebagai draft.</w:t>
-      </w:r>
-    </w:p>
-    <w:p>
-      <w:pPr>
-        <w:pStyle w:val="ListNumber"/>
-      </w:pPr>
-      <w:r>
-        <w:t>Lengkapi Bahasa Indonesia dan English.</w:t>
-      </w:r>
-    </w:p>
-    <w:p>
-      <w:pPr>
-        <w:pStyle w:val="ListNumber"/>
-      </w:pPr>
-      <w:r>
-        <w:t>Periksa URL, persyaratan, unit pemilik, tanggal, dan kontak.</w:t>
-      </w:r>
-    </w:p>
-    <w:p>
-      <w:pPr>
-        <w:pStyle w:val="ListNumber"/>
-      </w:pPr>
-      <w:r>
-        <w:t>Gunakan Preview publik bila diperlukan.</w:t>
-      </w:r>
-    </w:p>
-    <w:p>
-      <w:pPr>
-        <w:pStyle w:val="ListNumber"/>
-      </w:pPr>
-      <w:r>
-        <w:t>Aktifkan Terbit/Aktif.</w:t>
-      </w:r>
-    </w:p>
-    <w:p>
-      <w:pPr>
-        <w:pStyle w:val="ListNumber"/>
-      </w:pPr>
-      <w:r>
-        <w:t>Buka halaman publik ID dan EN untuk memastikan hasil.</w:t>
-      </w:r>
-    </w:p>
-    <w:p>
-      <w:pPr>
-        <w:pStyle w:val="ListNumber"/>
-      </w:pPr>
-      <w:r>
-        <w:t>Catat perubahan penting dan jadwalkan tinjauan berkala.</w:t>
+        <w:t>Format gambar yang diterima adalah JPG, PNG, dan WebP dengan ukuran maksimal 5 MB. Gunakan nama deskriptif, kompres gambar, dan pastikan hak penggunaan. Pada server, php artisan storage:link harus dijalankan satu kali agar upload dapat dibuka publik.</w:t>
       </w:r>
     </w:p>
     <w:p>
@@ -309,12 +2265,79 @@
         <w:pStyle w:val="Heading1"/>
       </w:pPr>
       <w:r>
-        <w:t>8. Upload Gambar</w:t>
+        <w:t>Pemeriksaan sebelum publikasi</w:t>
       </w:r>
     </w:p>
     <w:p>
+      <w:pPr>
+        <w:pStyle w:val="ListBullet"/>
+      </w:pPr>
       <w:r>
-        <w:t>Format yang diterima: JPG, PNG, dan WebP, maksimal 5 MB. Gunakan nama file deskriptif, kompres gambar, dan pastikan hak penggunaan/copyright. Jalankan php artisan storage:link satu kali pada server agar upload tampil publik.</w:t>
+        <w:t>Bahasa Indonesia dan English lengkap</w:t>
+      </w:r>
+    </w:p>
+    <w:p>
+      <w:pPr>
+        <w:pStyle w:val="ListBullet"/>
+      </w:pPr>
+      <w:r>
+        <w:t>Judul dan ringkasan mudah dipahami</w:t>
+      </w:r>
+    </w:p>
+    <w:p>
+      <w:pPr>
+        <w:pStyle w:val="ListBullet"/>
+      </w:pPr>
+      <w:r>
+        <w:t>Persyaratan dan prosedur telah diverifikasi</w:t>
+      </w:r>
+    </w:p>
+    <w:p>
+      <w:pPr>
+        <w:pStyle w:val="ListBullet"/>
+      </w:pPr>
+      <w:r>
+        <w:t>URL resmi dan memakai HTTPS</w:t>
+      </w:r>
+    </w:p>
+    <w:p>
+      <w:pPr>
+        <w:pStyle w:val="ListBullet"/>
+      </w:pPr>
+      <w:r>
+        <w:t>Tombol kontak dapat dibuka</w:t>
+      </w:r>
+    </w:p>
+    <w:p>
+      <w:pPr>
+        <w:pStyle w:val="ListBullet"/>
+      </w:pPr>
+      <w:r>
+        <w:t>Hak penggunaan gambar jelas</w:t>
+      </w:r>
+    </w:p>
+    <w:p>
+      <w:pPr>
+        <w:pStyle w:val="ListBullet"/>
+      </w:pPr>
+      <w:r>
+        <w:t>Pemilik konten terisi</w:t>
+      </w:r>
+    </w:p>
+    <w:p>
+      <w:pPr>
+        <w:pStyle w:val="ListBullet"/>
+      </w:pPr>
+      <w:r>
+        <w:t>Status dan waktu terbit benar</w:t>
+      </w:r>
+    </w:p>
+    <w:p>
+      <w:pPr>
+        <w:pStyle w:val="ListBullet"/>
+      </w:pPr>
+      <w:r>
+        <w:t>Tampilan ponsel dan desktop diperiksa</w:t>
       </w:r>
     </w:p>
     <w:p>
@@ -322,7 +2345,294 @@
         <w:pStyle w:val="Heading1"/>
       </w:pPr>
       <w:r>
-        <w:t>9. Troubleshooting</w:t>
+        <w:t>Pemecahan masalah</w:t>
+      </w:r>
+    </w:p>
+    <w:tbl>
+      <w:tblPr>
+        <w:tblStyle w:val="TableGrid"/>
+        <w:tblW w:type="auto" w:w="0"/>
+        <w:tblLayout w:type="fixed"/>
+        <w:tblLook w:firstColumn="1" w:firstRow="1" w:lastColumn="0" w:lastRow="0" w:noHBand="0" w:noVBand="1" w:val="04A0"/>
+        <w:tblBorders>
+          <w:top w:val="single" w:sz="4" w:color="D9D9D9"/>
+          <w:left w:val="single" w:sz="4" w:color="D9D9D9"/>
+          <w:bottom w:val="single" w:sz="4" w:color="D9D9D9"/>
+          <w:right w:val="single" w:sz="4" w:color="D9D9D9"/>
+          <w:insideH w:val="single" w:sz="4" w:color="D9D9D9"/>
+          <w:insideV w:val="single" w:sz="4" w:color="D9D9D9"/>
+        </w:tblBorders>
+      </w:tblPr>
+      <w:tblGrid>
+        <w:gridCol w:w="4997"/>
+        <w:gridCol w:w="4997"/>
+      </w:tblGrid>
+      <w:tr>
+        <w:tc>
+          <w:tcPr>
+            <w:tcW w:type="dxa" w:w="2880"/>
+            <w:shd w:fill="292129"/>
+            <w:vAlign w:val="center"/>
+          </w:tcPr>
+          <w:p>
+            <w:r>
+              <w:rPr>
+                <w:b/>
+                <w:color w:val="FFFFFF"/>
+                <w:sz w:val="18"/>
+              </w:rPr>
+              <w:t>Masalah</w:t>
+            </w:r>
+          </w:p>
+        </w:tc>
+        <w:tc>
+          <w:tcPr>
+            <w:tcW w:type="dxa" w:w="6696"/>
+            <w:shd w:fill="292129"/>
+            <w:vAlign w:val="center"/>
+          </w:tcPr>
+          <w:p>
+            <w:r>
+              <w:rPr>
+                <w:b/>
+                <w:color w:val="FFFFFF"/>
+                <w:sz w:val="18"/>
+              </w:rPr>
+              <w:t>Pemeriksaan</w:t>
+            </w:r>
+          </w:p>
+        </w:tc>
+      </w:tr>
+      <w:tr>
+        <w:tc>
+          <w:tcPr>
+            <w:tcW w:type="dxa" w:w="2880"/>
+            <w:vAlign w:val="center"/>
+          </w:tcPr>
+          <w:p>
+            <w:pPr>
+              <w:spacing w:after="40"/>
+            </w:pPr>
+            <w:r>
+              <w:rPr>
+                <w:sz w:val="17"/>
+              </w:rPr>
+              <w:t>Tidak dapat login</w:t>
+            </w:r>
+          </w:p>
+        </w:tc>
+        <w:tc>
+          <w:tcPr>
+            <w:tcW w:type="dxa" w:w="6696"/>
+            <w:vAlign w:val="center"/>
+          </w:tcPr>
+          <w:p>
+            <w:pPr>
+              <w:spacing w:after="40"/>
+            </w:pPr>
+            <w:r>
+              <w:rPr>
+                <w:sz w:val="17"/>
+              </w:rPr>
+              <w:t>Periksa email, password, is_admin, email_verified_at, dan ADMIN_ALLOWED_DOMAINS</w:t>
+            </w:r>
+          </w:p>
+        </w:tc>
+      </w:tr>
+      <w:tr>
+        <w:tc>
+          <w:tcPr>
+            <w:tcW w:type="dxa" w:w="2880"/>
+            <w:vAlign w:val="center"/>
+            <w:shd w:fill="F7F0F6"/>
+          </w:tcPr>
+          <w:p>
+            <w:pPr>
+              <w:spacing w:after="40"/>
+            </w:pPr>
+            <w:r>
+              <w:rPr>
+                <w:sz w:val="17"/>
+              </w:rPr>
+              <w:t>Perubahan belum terlihat</w:t>
+            </w:r>
+          </w:p>
+        </w:tc>
+        <w:tc>
+          <w:tcPr>
+            <w:tcW w:type="dxa" w:w="6696"/>
+            <w:vAlign w:val="center"/>
+            <w:shd w:fill="F7F0F6"/>
+          </w:tcPr>
+          <w:p>
+            <w:pPr>
+              <w:spacing w:after="40"/>
+            </w:pPr>
+            <w:r>
+              <w:rPr>
+                <w:sz w:val="17"/>
+              </w:rPr>
+              <w:t>Periksa status Terbit, waktu terbit, bahasa, lalu muat ulang halaman</w:t>
+            </w:r>
+          </w:p>
+        </w:tc>
+      </w:tr>
+      <w:tr>
+        <w:tc>
+          <w:tcPr>
+            <w:tcW w:type="dxa" w:w="2880"/>
+            <w:vAlign w:val="center"/>
+          </w:tcPr>
+          <w:p>
+            <w:pPr>
+              <w:spacing w:after="40"/>
+            </w:pPr>
+            <w:r>
+              <w:rPr>
+                <w:sz w:val="17"/>
+              </w:rPr>
+              <w:t>Gambar tidak tampil</w:t>
+            </w:r>
+          </w:p>
+        </w:tc>
+        <w:tc>
+          <w:tcPr>
+            <w:tcW w:type="dxa" w:w="6696"/>
+            <w:vAlign w:val="center"/>
+          </w:tcPr>
+          <w:p>
+            <w:pPr>
+              <w:spacing w:after="40"/>
+            </w:pPr>
+            <w:r>
+              <w:rPr>
+                <w:sz w:val="17"/>
+              </w:rPr>
+              <w:t>Periksa storage link, izin storage/app/public, dan file upload</w:t>
+            </w:r>
+          </w:p>
+        </w:tc>
+      </w:tr>
+      <w:tr>
+        <w:tc>
+          <w:tcPr>
+            <w:tcW w:type="dxa" w:w="2880"/>
+            <w:vAlign w:val="center"/>
+            <w:shd w:fill="F7F0F6"/>
+          </w:tcPr>
+          <w:p>
+            <w:pPr>
+              <w:spacing w:after="40"/>
+            </w:pPr>
+            <w:r>
+              <w:rPr>
+                <w:sz w:val="17"/>
+              </w:rPr>
+              <w:t>Impor CSV gagal</w:t>
+            </w:r>
+          </w:p>
+        </w:tc>
+        <w:tc>
+          <w:tcPr>
+            <w:tcW w:type="dxa" w:w="6696"/>
+            <w:vAlign w:val="center"/>
+            <w:shd w:fill="F7F0F6"/>
+          </w:tcPr>
+          <w:p>
+            <w:pPr>
+              <w:spacing w:after="40"/>
+            </w:pPr>
+            <w:r>
+              <w:rPr>
+                <w:sz w:val="17"/>
+              </w:rPr>
+              <w:t>Periksa header, encoding UTF-8, category_slug, kolom wajib, tanda kutip, dan jumlah kolom</w:t>
+            </w:r>
+          </w:p>
+        </w:tc>
+      </w:tr>
+      <w:tr>
+        <w:tc>
+          <w:tcPr>
+            <w:tcW w:type="dxa" w:w="2880"/>
+            <w:vAlign w:val="center"/>
+          </w:tcPr>
+          <w:p>
+            <w:pPr>
+              <w:spacing w:after="40"/>
+            </w:pPr>
+            <w:r>
+              <w:rPr>
+                <w:sz w:val="17"/>
+              </w:rPr>
+              <w:t>Admin lambat</w:t>
+            </w:r>
+          </w:p>
+        </w:tc>
+        <w:tc>
+          <w:tcPr>
+            <w:tcW w:type="dxa" w:w="6696"/>
+            <w:vAlign w:val="center"/>
+          </w:tcPr>
+          <w:p>
+            <w:pPr>
+              <w:spacing w:after="40"/>
+            </w:pPr>
+            <w:r>
+              <w:rPr>
+                <w:sz w:val="17"/>
+              </w:rPr>
+              <w:t>Gunakan APP_DEBUG=false, OPcache, php artisan optimize, dan resource database yang cukup</w:t>
+            </w:r>
+          </w:p>
+        </w:tc>
+      </w:tr>
+      <w:tr>
+        <w:tc>
+          <w:tcPr>
+            <w:tcW w:type="dxa" w:w="2880"/>
+            <w:vAlign w:val="center"/>
+            <w:shd w:fill="F7F0F6"/>
+          </w:tcPr>
+          <w:p>
+            <w:pPr>
+              <w:spacing w:after="40"/>
+            </w:pPr>
+            <w:r>
+              <w:rPr>
+                <w:sz w:val="17"/>
+              </w:rPr>
+              <w:t>Teks mode gelap tidak jelas</w:t>
+            </w:r>
+          </w:p>
+        </w:tc>
+        <w:tc>
+          <w:tcPr>
+            <w:tcW w:type="dxa" w:w="6696"/>
+            <w:vAlign w:val="center"/>
+            <w:shd w:fill="F7F0F6"/>
+          </w:tcPr>
+          <w:p>
+            <w:pPr>
+              <w:spacing w:after="40"/>
+            </w:pPr>
+            <w:r>
+              <w:rPr>
+                <w:sz w:val="17"/>
+              </w:rPr>
+              <w:t>Muat ulang aset terbaru dan hapus cache browser/CDN setelah deployment</w:t>
+            </w:r>
+          </w:p>
+        </w:tc>
+      </w:tr>
+    </w:tbl>
+    <w:p/>
+    <w:p>
+      <w:pPr>
+        <w:pStyle w:val="Heading1"/>
+      </w:pPr>
+      <w:r>
+        <w:t>Keamanan operator</w:t>
       </w:r>
     </w:p>
     <w:p>
@@ -330,7 +2640,7 @@
         <w:pStyle w:val="ListBullet"/>
       </w:pPr>
       <w:r>
-        <w:t>Admin lambat: pastikan APP_DEBUG=false, OPcache aktif, database memiliki resource cukup, lalu jalankan php artisan optimize dan php artisan icons:cache.</w:t>
+        <w:t>Gunakan akun individual, password unik, dan password manager.</w:t>
       </w:r>
     </w:p>
     <w:p>
@@ -338,7 +2648,7 @@
         <w:pStyle w:val="ListBullet"/>
       </w:pPr>
       <w:r>
-        <w:t>Perubahan belum tampil: pastikan Terbit/Aktif menyala, waktu terbit tidak berada di masa depan, lalu bersihkan cache.</w:t>
+        <w:t>Jangan membagikan kredensial atau menyimpan password pada komputer bersama.</w:t>
       </w:r>
     </w:p>
     <w:p>
@@ -346,7 +2656,7 @@
         <w:pStyle w:val="ListBullet"/>
       </w:pPr>
       <w:r>
-        <w:t>Gambar tidak tampil: periksa storage link dan izin tulis storage/app/public.</w:t>
+        <w:t>Jangan mengunggah data pribadi, rahasia, atau dokumen internal ke konten publik.</w:t>
       </w:r>
     </w:p>
     <w:p>
@@ -354,7 +2664,7 @@
         <w:pStyle w:val="ListBullet"/>
       </w:pPr>
       <w:r>
-        <w:t>Tidak bisa menghapus kategori: pindahkan atau hapus layanan yang masih terkait terlebih dahulu.</w:t>
+        <w:t>Verifikasi domain tujuan sebelum menyimpan tautan.</w:t>
       </w:r>
     </w:p>
     <w:p>
@@ -362,7 +2672,7 @@
         <w:pStyle w:val="ListBullet"/>
       </w:pPr>
       <w:r>
-        <w:t>Halaman EN masih Indonesia: lengkapi tab English pada record terkait.</w:t>
+        <w:t>Lakukan backup database dan storage secara rutin serta uji proses pemulihan.</w:t>
       </w:r>
     </w:p>
     <w:p>
@@ -370,7 +2680,7 @@
         <w:pStyle w:val="ListBullet"/>
       </w:pPr>
       <w:r>
-        <w:t>Error 403 admin: periksa is_admin, email_verified_at, dan ADMIN_ALLOWED_DOMAINS.</w:t>
+        <w:t>Logout setelah menggunakan perangkat bersama.</w:t>
       </w:r>
     </w:p>
     <w:p>
@@ -378,140 +2688,363 @@
         <w:pStyle w:val="Heading1"/>
       </w:pPr>
       <w:r>
-        <w:t>10. Keamanan Operator</w:t>
+        <w:t>Batas kewenangan dan eskalasi</w:t>
       </w:r>
     </w:p>
     <w:p>
-      <w:pPr>
-        <w:pStyle w:val="ListBullet"/>
-      </w:pPr>
       <w:r>
-        <w:t>Jangan membagikan akun admin.</w:t>
+        <w:t>Admin konten tidak perlu mengubah file aplikasi, konfigurasi .env, struktur database, DNS, SSL, antrean, atau konfigurasi server. Laporkan pekerjaan berikut kepada administrator teknis dengan menyertakan waktu kejadian, URL halaman, langkah yang dilakukan, dan tangkapan layar error.</w:t>
       </w:r>
     </w:p>
-    <w:p>
-      <w:pPr>
-        <w:pStyle w:val="ListBullet"/>
-      </w:pPr>
-      <w:r>
-        <w:t>Gunakan password unik dan panjang serta password manager.</w:t>
-      </w:r>
-    </w:p>
-    <w:p>
-      <w:pPr>
-        <w:pStyle w:val="ListBullet"/>
-      </w:pPr>
-      <w:r>
-        <w:t>Logout pada komputer bersama.</w:t>
-      </w:r>
-    </w:p>
-    <w:p>
-      <w:pPr>
-        <w:pStyle w:val="ListBullet"/>
-      </w:pPr>
-      <w:r>
-        <w:t>Jangan mengunggah data pribadi atau dokumen rahasia.</w:t>
-      </w:r>
-    </w:p>
-    <w:p>
-      <w:pPr>
-        <w:pStyle w:val="ListBullet"/>
-      </w:pPr>
-      <w:r>
-        <w:t>Verifikasi link sebelum dipublikasikan.</w:t>
-      </w:r>
-    </w:p>
-    <w:p>
-      <w:pPr>
-        <w:pStyle w:val="ListBullet"/>
-      </w:pPr>
-      <w:r>
-        <w:t>Lakukan backup database dan storage secara rutin.</w:t>
-      </w:r>
-    </w:p>
-    <w:p>
-      <w:pPr>
-        <w:pStyle w:val="Heading1"/>
-      </w:pPr>
-      <w:r>
-        <w:t>11. Checklist Sebelum Publikasi</w:t>
-      </w:r>
-    </w:p>
-    <w:p>
-      <w:pPr>
-        <w:pStyle w:val="ListBullet"/>
-      </w:pPr>
-      <w:r>
-        <w:t>☐ Bahasa ID dan EN lengkap</w:t>
-      </w:r>
-    </w:p>
-    <w:p>
-      <w:pPr>
-        <w:pStyle w:val="ListBullet"/>
-      </w:pPr>
-      <w:r>
-        <w:t>☐ Judul dan ringkasan jelas</w:t>
-      </w:r>
-    </w:p>
-    <w:p>
-      <w:pPr>
-        <w:pStyle w:val="ListBullet"/>
-      </w:pPr>
-      <w:r>
-        <w:t>☐ Syarat/prosedur telah diverifikasi</w:t>
-      </w:r>
-    </w:p>
-    <w:p>
-      <w:pPr>
-        <w:pStyle w:val="ListBullet"/>
-      </w:pPr>
-      <w:r>
-        <w:t>☐ URL resmi dan HTTPS</w:t>
-      </w:r>
-    </w:p>
-    <w:p>
-      <w:pPr>
-        <w:pStyle w:val="ListBullet"/>
-      </w:pPr>
-      <w:r>
-        <w:t>☐ Kontak resmi</w:t>
-      </w:r>
-    </w:p>
-    <w:p>
-      <w:pPr>
-        <w:pStyle w:val="ListBullet"/>
-      </w:pPr>
-      <w:r>
-        <w:t>☐ Gambar legal dan terkompresi</w:t>
-      </w:r>
-    </w:p>
-    <w:p>
-      <w:pPr>
-        <w:pStyle w:val="ListBullet"/>
-      </w:pPr>
-      <w:r>
-        <w:t>☐ Pemilik konten terisi</w:t>
-      </w:r>
-    </w:p>
-    <w:p>
-      <w:pPr>
-        <w:pStyle w:val="ListBullet"/>
-      </w:pPr>
-      <w:r>
-        <w:t>☐ Status terbit benar</w:t>
-      </w:r>
-    </w:p>
-    <w:p>
-      <w:pPr>
-        <w:pStyle w:val="ListBullet"/>
-      </w:pPr>
-      <w:r>
-        <w:t>☐ Tampilan mobile diperiksa</w:t>
-      </w:r>
-    </w:p>
+    <w:tbl>
+      <w:tblPr>
+        <w:tblStyle w:val="TableGrid"/>
+        <w:tblW w:type="auto" w:w="0"/>
+        <w:tblLayout w:type="fixed"/>
+        <w:tblLook w:firstColumn="1" w:firstRow="1" w:lastColumn="0" w:lastRow="0" w:noHBand="0" w:noVBand="1" w:val="04A0"/>
+        <w:tblBorders>
+          <w:top w:val="single" w:sz="4" w:color="D9D9D9"/>
+          <w:left w:val="single" w:sz="4" w:color="D9D9D9"/>
+          <w:bottom w:val="single" w:sz="4" w:color="D9D9D9"/>
+          <w:right w:val="single" w:sz="4" w:color="D9D9D9"/>
+          <w:insideH w:val="single" w:sz="4" w:color="D9D9D9"/>
+          <w:insideV w:val="single" w:sz="4" w:color="D9D9D9"/>
+        </w:tblBorders>
+      </w:tblPr>
+      <w:tblGrid>
+        <w:gridCol w:w="3331"/>
+        <w:gridCol w:w="3331"/>
+        <w:gridCol w:w="3331"/>
+      </w:tblGrid>
+      <w:tr>
+        <w:tc>
+          <w:tcPr>
+            <w:tcW w:type="dxa" w:w="3096"/>
+            <w:shd w:fill="292129"/>
+            <w:vAlign w:val="center"/>
+          </w:tcPr>
+          <w:p>
+            <w:r>
+              <w:rPr>
+                <w:b/>
+                <w:color w:val="FFFFFF"/>
+                <w:sz w:val="18"/>
+              </w:rPr>
+              <w:t>Kondisi</w:t>
+            </w:r>
+          </w:p>
+        </w:tc>
+        <w:tc>
+          <w:tcPr>
+            <w:tcW w:type="dxa" w:w="4032"/>
+            <w:shd w:fill="292129"/>
+            <w:vAlign w:val="center"/>
+          </w:tcPr>
+          <w:p>
+            <w:r>
+              <w:rPr>
+                <w:b/>
+                <w:color w:val="FFFFFF"/>
+                <w:sz w:val="18"/>
+              </w:rPr>
+              <w:t>Tindakan admin</w:t>
+            </w:r>
+          </w:p>
+        </w:tc>
+        <w:tc>
+          <w:tcPr>
+            <w:tcW w:type="dxa" w:w="2520"/>
+            <w:shd w:fill="292129"/>
+            <w:vAlign w:val="center"/>
+          </w:tcPr>
+          <w:p>
+            <w:r>
+              <w:rPr>
+                <w:b/>
+                <w:color w:val="FFFFFF"/>
+                <w:sz w:val="18"/>
+              </w:rPr>
+              <w:t>Tujuan eskalasi</w:t>
+            </w:r>
+          </w:p>
+        </w:tc>
+      </w:tr>
+      <w:tr>
+        <w:tc>
+          <w:tcPr>
+            <w:tcW w:type="dxa" w:w="3096"/>
+            <w:vAlign w:val="center"/>
+          </w:tcPr>
+          <w:p>
+            <w:pPr>
+              <w:spacing w:after="40"/>
+            </w:pPr>
+            <w:r>
+              <w:rPr>
+                <w:sz w:val="17"/>
+              </w:rPr>
+              <w:t>Error 500 atau halaman tidak dapat dibuka</w:t>
+            </w:r>
+          </w:p>
+        </w:tc>
+        <w:tc>
+          <w:tcPr>
+            <w:tcW w:type="dxa" w:w="4032"/>
+            <w:vAlign w:val="center"/>
+          </w:tcPr>
+          <w:p>
+            <w:pPr>
+              <w:spacing w:after="40"/>
+            </w:pPr>
+            <w:r>
+              <w:rPr>
+                <w:sz w:val="17"/>
+              </w:rPr>
+              <w:t>Hentikan percobaan berulang dan catat URL serta waktu</w:t>
+            </w:r>
+          </w:p>
+        </w:tc>
+        <w:tc>
+          <w:tcPr>
+            <w:tcW w:type="dxa" w:w="2520"/>
+            <w:vAlign w:val="center"/>
+          </w:tcPr>
+          <w:p>
+            <w:pPr>
+              <w:spacing w:after="40"/>
+            </w:pPr>
+            <w:r>
+              <w:rPr>
+                <w:sz w:val="17"/>
+              </w:rPr>
+              <w:t>Administrator aplikasi</w:t>
+            </w:r>
+          </w:p>
+        </w:tc>
+      </w:tr>
+      <w:tr>
+        <w:tc>
+          <w:tcPr>
+            <w:tcW w:type="dxa" w:w="3096"/>
+            <w:vAlign w:val="center"/>
+            <w:shd w:fill="F7F0F6"/>
+          </w:tcPr>
+          <w:p>
+            <w:pPr>
+              <w:spacing w:after="40"/>
+            </w:pPr>
+            <w:r>
+              <w:rPr>
+                <w:sz w:val="17"/>
+              </w:rPr>
+              <w:t>Database atau upload tidak tersimpan</w:t>
+            </w:r>
+          </w:p>
+        </w:tc>
+        <w:tc>
+          <w:tcPr>
+            <w:tcW w:type="dxa" w:w="4032"/>
+            <w:vAlign w:val="center"/>
+            <w:shd w:fill="F7F0F6"/>
+          </w:tcPr>
+          <w:p>
+            <w:pPr>
+              <w:spacing w:after="40"/>
+            </w:pPr>
+            <w:r>
+              <w:rPr>
+                <w:sz w:val="17"/>
+              </w:rPr>
+              <w:t>Simpan salinan konten secara lokal dan laporkan</w:t>
+            </w:r>
+          </w:p>
+        </w:tc>
+        <w:tc>
+          <w:tcPr>
+            <w:tcW w:type="dxa" w:w="2520"/>
+            <w:vAlign w:val="center"/>
+            <w:shd w:fill="F7F0F6"/>
+          </w:tcPr>
+          <w:p>
+            <w:pPr>
+              <w:spacing w:after="40"/>
+            </w:pPr>
+            <w:r>
+              <w:rPr>
+                <w:sz w:val="17"/>
+              </w:rPr>
+              <w:t>Administrator database/server</w:t>
+            </w:r>
+          </w:p>
+        </w:tc>
+      </w:tr>
+      <w:tr>
+        <w:tc>
+          <w:tcPr>
+            <w:tcW w:type="dxa" w:w="3096"/>
+            <w:vAlign w:val="center"/>
+          </w:tcPr>
+          <w:p>
+            <w:pPr>
+              <w:spacing w:after="40"/>
+            </w:pPr>
+            <w:r>
+              <w:rPr>
+                <w:sz w:val="17"/>
+              </w:rPr>
+              <w:t>Domain, HTTPS, atau DNS bermasalah</w:t>
+            </w:r>
+          </w:p>
+        </w:tc>
+        <w:tc>
+          <w:tcPr>
+            <w:tcW w:type="dxa" w:w="4032"/>
+            <w:vAlign w:val="center"/>
+          </w:tcPr>
+          <w:p>
+            <w:pPr>
+              <w:spacing w:after="40"/>
+            </w:pPr>
+            <w:r>
+              <w:rPr>
+                <w:sz w:val="17"/>
+              </w:rPr>
+              <w:t>Jangan mengubah link menjadi alamat sementara</w:t>
+            </w:r>
+          </w:p>
+        </w:tc>
+        <w:tc>
+          <w:tcPr>
+            <w:tcW w:type="dxa" w:w="2520"/>
+            <w:vAlign w:val="center"/>
+          </w:tcPr>
+          <w:p>
+            <w:pPr>
+              <w:spacing w:after="40"/>
+            </w:pPr>
+            <w:r>
+              <w:rPr>
+                <w:sz w:val="17"/>
+              </w:rPr>
+              <w:t>Tim infrastruktur</w:t>
+            </w:r>
+          </w:p>
+        </w:tc>
+      </w:tr>
+      <w:tr>
+        <w:tc>
+          <w:tcPr>
+            <w:tcW w:type="dxa" w:w="3096"/>
+            <w:vAlign w:val="center"/>
+            <w:shd w:fill="F7F0F6"/>
+          </w:tcPr>
+          <w:p>
+            <w:pPr>
+              <w:spacing w:after="40"/>
+            </w:pPr>
+            <w:r>
+              <w:rPr>
+                <w:sz w:val="17"/>
+              </w:rPr>
+              <w:t>Diduga akun disalahgunakan</w:t>
+            </w:r>
+          </w:p>
+        </w:tc>
+        <w:tc>
+          <w:tcPr>
+            <w:tcW w:type="dxa" w:w="4032"/>
+            <w:vAlign w:val="center"/>
+            <w:shd w:fill="F7F0F6"/>
+          </w:tcPr>
+          <w:p>
+            <w:pPr>
+              <w:spacing w:after="40"/>
+            </w:pPr>
+            <w:r>
+              <w:rPr>
+                <w:sz w:val="17"/>
+              </w:rPr>
+              <w:t>Logout, ganti password melalui prosedur resmi, dan laporkan</w:t>
+            </w:r>
+          </w:p>
+        </w:tc>
+        <w:tc>
+          <w:tcPr>
+            <w:tcW w:type="dxa" w:w="2520"/>
+            <w:vAlign w:val="center"/>
+            <w:shd w:fill="F7F0F6"/>
+          </w:tcPr>
+          <w:p>
+            <w:pPr>
+              <w:spacing w:after="40"/>
+            </w:pPr>
+            <w:r>
+              <w:rPr>
+                <w:sz w:val="17"/>
+              </w:rPr>
+              <w:t>Administrator keamanan</w:t>
+            </w:r>
+          </w:p>
+        </w:tc>
+      </w:tr>
+      <w:tr>
+        <w:tc>
+          <w:tcPr>
+            <w:tcW w:type="dxa" w:w="3096"/>
+            <w:vAlign w:val="center"/>
+          </w:tcPr>
+          <w:p>
+            <w:pPr>
+              <w:spacing w:after="40"/>
+            </w:pPr>
+            <w:r>
+              <w:rPr>
+                <w:sz w:val="17"/>
+              </w:rPr>
+              <w:t>Konten memuat data sensitif</w:t>
+            </w:r>
+          </w:p>
+        </w:tc>
+        <w:tc>
+          <w:tcPr>
+            <w:tcW w:type="dxa" w:w="4032"/>
+            <w:vAlign w:val="center"/>
+          </w:tcPr>
+          <w:p>
+            <w:pPr>
+              <w:spacing w:after="40"/>
+            </w:pPr>
+            <w:r>
+              <w:rPr>
+                <w:sz w:val="17"/>
+              </w:rPr>
+              <w:t>Batalkan terbit dan jangan menyebarkan salinan</w:t>
+            </w:r>
+          </w:p>
+        </w:tc>
+        <w:tc>
+          <w:tcPr>
+            <w:tcW w:type="dxa" w:w="2520"/>
+            <w:vAlign w:val="center"/>
+          </w:tcPr>
+          <w:p>
+            <w:pPr>
+              <w:spacing w:after="40"/>
+            </w:pPr>
+            <w:r>
+              <w:rPr>
+                <w:sz w:val="17"/>
+              </w:rPr>
+              <w:t>Pemilik konten dan keamanan</w:t>
+            </w:r>
+          </w:p>
+        </w:tc>
+      </w:tr>
+    </w:tbl>
+    <w:p/>
     <w:sectPr>
       <w:pgSz w:w="12240" w:h="15840"/>
-      <w:pgMar w:top="1152" w:right="1440" w:bottom="1152" w:left="1440" w:header="720" w:footer="720" w:gutter="0"/>
+      <w:pgMar w:top="1037" w:right="1123" w:bottom="1037" w:left="1123" w:header="720" w:footer="720" w:gutter="0"/>
       <w:cols w:space="720"/>
       <w:docGrid w:linePitch="360"/>
     </w:sectPr>
@@ -883,11 +3416,11 @@
     <w:qFormat/>
     <w:rsid w:val="00FC693F"/>
     <w:pPr>
-      <w:spacing w:after="120" w:line="288" w:lineRule="auto"/>
+      <w:spacing w:after="120" w:line="276" w:lineRule="auto"/>
     </w:pPr>
     <w:rPr>
-      <w:rFonts w:ascii="Calibri" w:hAnsi="Calibri"/>
-      <w:sz w:val="22"/>
+      <w:rFonts w:ascii="Aptos" w:hAnsi="Aptos"/>
+      <w:sz w:val="21"/>
     </w:rPr>
   </w:style>
   <w:style w:type="paragraph" w:styleId="Header">
@@ -945,14 +3478,14 @@
     <w:pPr>
       <w:keepNext/>
       <w:keepLines/>
-      <w:spacing w:before="480" w:after="0"/>
+      <w:spacing w:before="240" w:after="120"/>
       <w:outlineLvl w:val="0"/>
     </w:pPr>
     <w:rPr>
-      <w:rFonts w:asciiTheme="majorHAnsi" w:eastAsiaTheme="majorEastAsia" w:hAnsiTheme="majorHAnsi" w:cstheme="majorBidi" w:ascii="Calibri" w:hAnsi="Calibri"/>
+      <w:rFonts w:asciiTheme="majorHAnsi" w:eastAsiaTheme="majorEastAsia" w:hAnsiTheme="majorHAnsi" w:cstheme="majorBidi" w:ascii="Aptos Display" w:hAnsi="Aptos Display"/>
       <w:b/>
       <w:bCs/>
-      <w:color w:val="701D6B"/>
+      <w:color w:val="000000"/>
       <w:sz w:val="34"/>
       <w:szCs w:val="28"/>
     </w:rPr>
@@ -969,15 +3502,15 @@
     <w:pPr>
       <w:keepNext/>
       <w:keepLines/>
-      <w:spacing w:before="200" w:after="0"/>
+      <w:spacing w:before="240" w:after="120"/>
       <w:outlineLvl w:val="1"/>
     </w:pPr>
     <w:rPr>
-      <w:rFonts w:asciiTheme="majorHAnsi" w:eastAsiaTheme="majorEastAsia" w:hAnsiTheme="majorHAnsi" w:cstheme="majorBidi" w:ascii="Calibri" w:hAnsi="Calibri"/>
+      <w:rFonts w:asciiTheme="majorHAnsi" w:eastAsiaTheme="majorEastAsia" w:hAnsiTheme="majorHAnsi" w:cstheme="majorBidi" w:ascii="Aptos Display" w:hAnsi="Aptos Display"/>
       <w:b/>
       <w:bCs/>
-      <w:color w:val="701D6B"/>
-      <w:sz w:val="28"/>
+      <w:color w:val="000000"/>
+      <w:sz w:val="26"/>
       <w:szCs w:val="26"/>
     </w:rPr>
   </w:style>
@@ -993,15 +3526,15 @@
     <w:pPr>
       <w:keepNext/>
       <w:keepLines/>
-      <w:spacing w:before="200" w:after="0"/>
+      <w:spacing w:before="240" w:after="120"/>
       <w:outlineLvl w:val="2"/>
     </w:pPr>
     <w:rPr>
-      <w:rFonts w:asciiTheme="majorHAnsi" w:eastAsiaTheme="majorEastAsia" w:hAnsiTheme="majorHAnsi" w:cstheme="majorBidi" w:ascii="Calibri" w:hAnsi="Calibri"/>
+      <w:rFonts w:asciiTheme="majorHAnsi" w:eastAsiaTheme="majorEastAsia" w:hAnsiTheme="majorHAnsi" w:cstheme="majorBidi" w:ascii="Aptos Display" w:hAnsi="Aptos Display"/>
       <w:b/>
       <w:bCs/>
-      <w:color w:val="701D6B"/>
-      <w:sz w:val="24"/>
+      <w:color w:val="000000"/>
+      <w:sz w:val="22"/>
     </w:rPr>
   </w:style>
   <w:style w:type="paragraph" w:styleId="Heading4">
@@ -1232,18 +3765,17 @@
     <w:qFormat/>
     <w:rsid w:val="00FC693F"/>
     <w:pPr>
-      <w:pBdr>
-        <w:bottom w:val="single" w:sz="8" w:space="4" w:color="4F81BD" w:themeColor="accent1"/>
-      </w:pBdr>
-      <w:spacing w:after="300" w:line="240" w:lineRule="auto"/>
+      <w:keepNext/>
+      <w:spacing w:after="120" w:line="240" w:lineRule="auto" w:before="240"/>
       <w:contextualSpacing/>
     </w:pPr>
     <w:rPr>
-      <w:rFonts w:asciiTheme="majorHAnsi" w:eastAsiaTheme="majorEastAsia" w:hAnsiTheme="majorHAnsi" w:cstheme="majorBidi"/>
-      <w:color w:val="17365D" w:themeColor="text2" w:themeShade="BF"/>
+      <w:rFonts w:asciiTheme="majorHAnsi" w:eastAsiaTheme="majorEastAsia" w:hAnsiTheme="majorHAnsi" w:cstheme="majorBidi" w:ascii="Aptos Display" w:hAnsi="Aptos Display"/>
+      <w:b/>
+      <w:color w:val="000000"/>
       <w:spacing w:val="5"/>
       <w:kern w:val="28"/>
-      <w:sz w:val="52"/>
+      <w:sz w:val="50"/>
       <w:szCs w:val="52"/>
     </w:rPr>
   </w:style>

</xml_diff>